<commit_message>
Add segment dialog, Loads defined
</commit_message>
<xml_diff>
--- a/src/SRS.docx
+++ b/src/SRS.docx
@@ -2,6 +2,1382 @@
 <file path=word/document.xml><?xml version="1.0" encoding="utf-8"?>
 <w:document xmlns:wpc="http://schemas.microsoft.com/office/word/2010/wordprocessingCanvas" xmlns:cx="http://schemas.microsoft.com/office/drawing/2014/chartex" xmlns:cx1="http://schemas.microsoft.com/office/drawing/2015/9/8/chartex" xmlns:cx2="http://schemas.microsoft.com/office/drawing/2015/10/21/chartex" xmlns:cx3="http://schemas.microsoft.com/office/drawing/2016/5/9/chartex" xmlns:cx4="http://schemas.microsoft.com/office/drawing/2016/5/10/chartex" xmlns:cx5="http://schemas.microsoft.com/office/drawing/2016/5/11/chartex" xmlns:cx6="http://schemas.microsoft.com/office/drawing/2016/5/12/chartex" xmlns:cx7="http://schemas.microsoft.com/office/drawing/2016/5/13/chartex" xmlns:cx8="http://schemas.microsoft.com/office/drawing/2016/5/14/chartex" xmlns:mc="http://schemas.openxmlformats.org/markup-compatibility/2006" xmlns:aink="http://schemas.microsoft.com/office/drawing/2016/ink" xmlns:am3d="http://schemas.microsoft.com/office/drawing/2017/model3d" xmlns:o="urn:schemas-microsoft-com:office:office" xmlns:oel="http://schemas.microsoft.com/office/2019/extlst" xmlns:r="http://schemas.openxmlformats.org/officeDocument/2006/relationships" xmlns:m="http://schemas.openxmlformats.org/officeDocument/2006/math" xmlns:v="urn:schemas-microsoft-com:vml" xmlns:wp14="http://schemas.microsoft.com/office/word/2010/wordprocessingDrawing" xmlns:wp="http://schemas.openxmlformats.org/drawingml/2006/wordprocessingDrawing" xmlns:w10="urn:schemas-microsoft-com:office:word" xmlns:w="http://schemas.openxmlformats.org/wordprocessingml/2006/main" xmlns:w14="http://schemas.microsoft.com/office/word/2010/wordml" xmlns:w15="http://schemas.microsoft.com/office/word/2012/wordml" xmlns:w16cex="http://schemas.microsoft.com/office/word/2018/wordml/cex" xmlns:w16cid="http://schemas.microsoft.com/office/word/2016/wordml/cid" xmlns:w16="http://schemas.microsoft.com/office/word/2018/wordml" xmlns:w16du="http://schemas.microsoft.com/office/word/2023/wordml/word16du" xmlns:w16sdtdh="http://schemas.microsoft.com/office/word/2020/wordml/sdtdatahash" xmlns:w16se="http://schemas.microsoft.com/office/word/2015/wordml/symex" xmlns:wpg="http://schemas.microsoft.com/office/word/2010/wordprocessingGroup" xmlns:wpi="http://schemas.microsoft.com/office/word/2010/wordprocessingInk" xmlns:wne="http://schemas.microsoft.com/office/word/2006/wordml" xmlns:wps="http://schemas.microsoft.com/office/word/2010/wordprocessingShape" mc:Ignorable="w14 w15 w16se w16cid w16 w16cex w16sdtdh w16du wp14">
   <w:body>
+    <w:p>
+      <w:pPr>
+        <w:rPr>
+          <w:b/>
+          <w:bCs/>
+        </w:rPr>
+      </w:pPr>
+      <w:r>
+        <w:rPr>
+          <w:b/>
+          <w:bCs/>
+        </w:rPr>
+        <w:t>Software Requirements Specification (SRS)</w:t>
+      </w:r>
+    </w:p>
+    <w:p>
+      <w:pPr>
+        <w:rPr>
+          <w:b/>
+          <w:bCs/>
+        </w:rPr>
+      </w:pPr>
+      <w:r>
+        <w:rPr>
+          <w:b/>
+          <w:bCs/>
+        </w:rPr>
+        <w:t>Elevated Water Tank Design Tool (Open Source)</w:t>
+      </w:r>
+    </w:p>
+    <w:p>
+      <w:pPr>
+        <w:rPr>
+          <w:b/>
+          <w:bCs/>
+        </w:rPr>
+      </w:pPr>
+      <w:r>
+        <w:rPr>
+          <w:b/>
+          <w:bCs/>
+        </w:rPr>
+        <w:pict w14:anchorId="06B15A8E">
+          <v:rect id="_x0000_i1067" style="width:0;height:1.5pt" o:hralign="center" o:hrstd="t" o:hr="t" fillcolor="#a0a0a0" stroked="f"/>
+        </w:pict>
+      </w:r>
+    </w:p>
+    <w:p>
+      <w:pPr>
+        <w:rPr>
+          <w:b/>
+          <w:bCs/>
+        </w:rPr>
+      </w:pPr>
+      <w:r>
+        <w:rPr>
+          <w:b/>
+          <w:bCs/>
+        </w:rPr>
+        <w:t>1. Introduction</w:t>
+      </w:r>
+    </w:p>
+    <w:p>
+      <w:pPr>
+        <w:rPr>
+          <w:b/>
+          <w:bCs/>
+        </w:rPr>
+      </w:pPr>
+      <w:r>
+        <w:rPr>
+          <w:b/>
+          <w:bCs/>
+        </w:rPr>
+        <w:t>1.1. Purpose</w:t>
+      </w:r>
+    </w:p>
+    <w:p>
+      <w:r>
+        <w:t>The purpose of this document is to specify the software requirements for the development of an Elevated Water Tank Design Tool. This tool will enable users to design elevated water tanks with a spherical top and a single pedestal column. The focus will be on calculating structural and load parameters, generating 2D outputs, and ensuring compliance with design standards.</w:t>
+      </w:r>
+    </w:p>
+    <w:p>
+      <w:pPr>
+        <w:rPr>
+          <w:b/>
+          <w:bCs/>
+        </w:rPr>
+      </w:pPr>
+      <w:r>
+        <w:rPr>
+          <w:b/>
+          <w:bCs/>
+        </w:rPr>
+        <w:t>1.2. Scope</w:t>
+      </w:r>
+    </w:p>
+    <w:p>
+      <w:r>
+        <w:t>The Elevated Water Tank Design Tool is a desktop-based Windows Forms Application (WFA). The tool will allow users to input design parameters (such as tank dimensions, material properties, and load conditions) and generate 2D blueprints, along with calculations for structural analysis. The tool does not require 3D visualization and will be made available under an open-source license.</w:t>
+      </w:r>
+    </w:p>
+    <w:p>
+      <w:pPr>
+        <w:rPr>
+          <w:b/>
+          <w:bCs/>
+        </w:rPr>
+      </w:pPr>
+      <w:r>
+        <w:rPr>
+          <w:b/>
+          <w:bCs/>
+        </w:rPr>
+        <w:t>1.3. Definitions, Acronyms, and Abbreviations</w:t>
+      </w:r>
+    </w:p>
+    <w:p>
+      <w:pPr>
+        <w:numPr>
+          <w:ilvl w:val="0"/>
+          <w:numId w:val="1"/>
+        </w:numPr>
+        <w:rPr>
+          <w:b/>
+          <w:bCs/>
+        </w:rPr>
+      </w:pPr>
+      <w:r>
+        <w:rPr>
+          <w:b/>
+          <w:bCs/>
+        </w:rPr>
+        <w:t>WFA: Windows Forms Application</w:t>
+      </w:r>
+    </w:p>
+    <w:p>
+      <w:pPr>
+        <w:numPr>
+          <w:ilvl w:val="0"/>
+          <w:numId w:val="1"/>
+        </w:numPr>
+        <w:rPr>
+          <w:b/>
+          <w:bCs/>
+        </w:rPr>
+      </w:pPr>
+      <w:r>
+        <w:rPr>
+          <w:b/>
+          <w:bCs/>
+        </w:rPr>
+        <w:t>SRS: Software Requirements Specification</w:t>
+      </w:r>
+    </w:p>
+    <w:p>
+      <w:pPr>
+        <w:numPr>
+          <w:ilvl w:val="0"/>
+          <w:numId w:val="1"/>
+        </w:numPr>
+        <w:rPr>
+          <w:b/>
+          <w:bCs/>
+        </w:rPr>
+      </w:pPr>
+      <w:r>
+        <w:rPr>
+          <w:b/>
+          <w:bCs/>
+        </w:rPr>
+        <w:t>UI: User Interface</w:t>
+      </w:r>
+    </w:p>
+    <w:p>
+      <w:pPr>
+        <w:rPr>
+          <w:b/>
+          <w:bCs/>
+        </w:rPr>
+      </w:pPr>
+      <w:r>
+        <w:rPr>
+          <w:b/>
+          <w:bCs/>
+        </w:rPr>
+        <w:t>1.4. References</w:t>
+      </w:r>
+    </w:p>
+    <w:p>
+      <w:pPr>
+        <w:numPr>
+          <w:ilvl w:val="0"/>
+          <w:numId w:val="2"/>
+        </w:numPr>
+        <w:rPr>
+          <w:b/>
+          <w:bCs/>
+        </w:rPr>
+      </w:pPr>
+      <w:r>
+        <w:rPr>
+          <w:b/>
+          <w:bCs/>
+        </w:rPr>
+        <w:t>IS: 3370 - Indian Standard for Concrete Structures for Storage of Liquids.</w:t>
+      </w:r>
+    </w:p>
+    <w:p>
+      <w:pPr>
+        <w:numPr>
+          <w:ilvl w:val="0"/>
+          <w:numId w:val="2"/>
+        </w:numPr>
+        <w:rPr>
+          <w:b/>
+          <w:bCs/>
+        </w:rPr>
+      </w:pPr>
+      <w:r>
+        <w:rPr>
+          <w:b/>
+          <w:bCs/>
+        </w:rPr>
+        <w:t>ASCE 7 - American Society of Civil Engineers Standard for Load Calculations.</w:t>
+      </w:r>
+    </w:p>
+    <w:p>
+      <w:pPr>
+        <w:numPr>
+          <w:ilvl w:val="0"/>
+          <w:numId w:val="2"/>
+        </w:numPr>
+        <w:rPr>
+          <w:b/>
+          <w:bCs/>
+        </w:rPr>
+      </w:pPr>
+      <w:r>
+        <w:rPr>
+          <w:b/>
+          <w:bCs/>
+        </w:rPr>
+        <w:t xml:space="preserve">MIT License - </w:t>
+      </w:r>
+      <w:proofErr w:type="gramStart"/>
+      <w:r>
+        <w:rPr>
+          <w:b/>
+          <w:bCs/>
+        </w:rPr>
+        <w:t>Open source</w:t>
+      </w:r>
+      <w:proofErr w:type="gramEnd"/>
+      <w:r>
+        <w:rPr>
+          <w:b/>
+          <w:bCs/>
+        </w:rPr>
+        <w:t xml:space="preserve"> software license for this tool.</w:t>
+      </w:r>
+    </w:p>
+    <w:p>
+      <w:pPr>
+        <w:rPr>
+          <w:b/>
+          <w:bCs/>
+        </w:rPr>
+      </w:pPr>
+      <w:r>
+        <w:rPr>
+          <w:b/>
+          <w:bCs/>
+        </w:rPr>
+        <w:pict w14:anchorId="5CEBBBBF">
+          <v:rect id="_x0000_i1068" style="width:0;height:1.5pt" o:hralign="center" o:hrstd="t" o:hr="t" fillcolor="#a0a0a0" stroked="f"/>
+        </w:pict>
+      </w:r>
+    </w:p>
+    <w:p>
+      <w:pPr>
+        <w:rPr>
+          <w:b/>
+          <w:bCs/>
+        </w:rPr>
+      </w:pPr>
+      <w:r>
+        <w:rPr>
+          <w:b/>
+          <w:bCs/>
+        </w:rPr>
+        <w:t>2. Overall Description</w:t>
+      </w:r>
+    </w:p>
+    <w:p>
+      <w:pPr>
+        <w:rPr>
+          <w:b/>
+          <w:bCs/>
+        </w:rPr>
+      </w:pPr>
+      <w:r>
+        <w:rPr>
+          <w:b/>
+          <w:bCs/>
+        </w:rPr>
+        <w:t>2.1. Product Perspective</w:t>
+      </w:r>
+    </w:p>
+    <w:p>
+      <w:r>
+        <w:t xml:space="preserve">The Elevated Water Tank Design Tool is designed to be a stand-alone desktop application. The tool will provide users with the ability to create and analyze elevated water tanks with a </w:t>
+      </w:r>
+      <w:r>
+        <w:lastRenderedPageBreak/>
+        <w:t>spherical top and a single pedestal column. The output will consist of 2D blueprints and detailed analysis reports. As an open-source project, it will be accessible to engineers, students, and researchers.</w:t>
+      </w:r>
+    </w:p>
+    <w:p>
+      <w:pPr>
+        <w:rPr>
+          <w:b/>
+          <w:bCs/>
+        </w:rPr>
+      </w:pPr>
+      <w:r>
+        <w:rPr>
+          <w:b/>
+          <w:bCs/>
+        </w:rPr>
+        <w:t>2.2. Product Functions</w:t>
+      </w:r>
+    </w:p>
+    <w:p>
+      <w:pPr>
+        <w:numPr>
+          <w:ilvl w:val="0"/>
+          <w:numId w:val="3"/>
+        </w:numPr>
+        <w:rPr>
+          <w:b/>
+          <w:bCs/>
+        </w:rPr>
+      </w:pPr>
+      <w:r>
+        <w:rPr>
+          <w:b/>
+          <w:bCs/>
+        </w:rPr>
+        <w:t xml:space="preserve">Input Parameters: </w:t>
+      </w:r>
+      <w:r>
+        <w:t>Users can input tank dimensions (e.g., height, radius), material properties, and environmental load conditions.</w:t>
+      </w:r>
+    </w:p>
+    <w:p>
+      <w:pPr>
+        <w:numPr>
+          <w:ilvl w:val="0"/>
+          <w:numId w:val="3"/>
+        </w:numPr>
+        <w:rPr>
+          <w:b/>
+          <w:bCs/>
+        </w:rPr>
+      </w:pPr>
+      <w:r>
+        <w:rPr>
+          <w:b/>
+          <w:bCs/>
+        </w:rPr>
+        <w:t xml:space="preserve">Load and Stress Analysis: </w:t>
+      </w:r>
+      <w:r>
+        <w:t>The tool will calculate load, stress, and stability based on user input, and provide results according to IS and ASCE standards.</w:t>
+      </w:r>
+    </w:p>
+    <w:p>
+      <w:pPr>
+        <w:numPr>
+          <w:ilvl w:val="0"/>
+          <w:numId w:val="3"/>
+        </w:numPr>
+      </w:pPr>
+      <w:r>
+        <w:rPr>
+          <w:b/>
+          <w:bCs/>
+        </w:rPr>
+        <w:t xml:space="preserve">Design Outputs: </w:t>
+      </w:r>
+      <w:r>
+        <w:t>Users can generate 2D blueprint drawings, material specifications, and load calculation reports.</w:t>
+      </w:r>
+    </w:p>
+    <w:p>
+      <w:pPr>
+        <w:numPr>
+          <w:ilvl w:val="0"/>
+          <w:numId w:val="3"/>
+        </w:numPr>
+      </w:pPr>
+      <w:proofErr w:type="gramStart"/>
+      <w:r>
+        <w:rPr>
+          <w:b/>
+          <w:bCs/>
+        </w:rPr>
+        <w:t>Open Source</w:t>
+      </w:r>
+      <w:proofErr w:type="gramEnd"/>
+      <w:r>
+        <w:rPr>
+          <w:b/>
+          <w:bCs/>
+        </w:rPr>
+        <w:t xml:space="preserve"> Collaboration: </w:t>
+      </w:r>
+      <w:r>
+        <w:t>The project will be available for open-source contributions, with code hosted on GitHub.</w:t>
+      </w:r>
+    </w:p>
+    <w:p>
+      <w:pPr>
+        <w:rPr>
+          <w:b/>
+          <w:bCs/>
+        </w:rPr>
+      </w:pPr>
+      <w:r>
+        <w:rPr>
+          <w:b/>
+          <w:bCs/>
+        </w:rPr>
+        <w:t>2.3. User Characteristics</w:t>
+      </w:r>
+    </w:p>
+    <w:p>
+      <w:pPr>
+        <w:numPr>
+          <w:ilvl w:val="0"/>
+          <w:numId w:val="4"/>
+        </w:numPr>
+      </w:pPr>
+      <w:r>
+        <w:rPr>
+          <w:b/>
+          <w:bCs/>
+        </w:rPr>
+        <w:t xml:space="preserve">Engineers: </w:t>
+      </w:r>
+      <w:r>
+        <w:t>Users who need to perform detailed structural analysis of elevated water tanks.</w:t>
+      </w:r>
+    </w:p>
+    <w:p>
+      <w:pPr>
+        <w:numPr>
+          <w:ilvl w:val="0"/>
+          <w:numId w:val="4"/>
+        </w:numPr>
+      </w:pPr>
+      <w:r>
+        <w:rPr>
+          <w:b/>
+          <w:bCs/>
+        </w:rPr>
+        <w:t xml:space="preserve">Students/Researchers: </w:t>
+      </w:r>
+      <w:r>
+        <w:t>Users who need simplified design tools for academic or research purposes.</w:t>
+      </w:r>
+    </w:p>
+    <w:p>
+      <w:pPr>
+        <w:rPr>
+          <w:b/>
+          <w:bCs/>
+        </w:rPr>
+      </w:pPr>
+      <w:r>
+        <w:rPr>
+          <w:b/>
+          <w:bCs/>
+        </w:rPr>
+        <w:t>2.4. Constraints</w:t>
+      </w:r>
+    </w:p>
+    <w:p>
+      <w:pPr>
+        <w:numPr>
+          <w:ilvl w:val="0"/>
+          <w:numId w:val="5"/>
+        </w:numPr>
+      </w:pPr>
+      <w:r>
+        <w:t>The application will be developed for Windows platforms.</w:t>
+      </w:r>
+    </w:p>
+    <w:p>
+      <w:pPr>
+        <w:numPr>
+          <w:ilvl w:val="0"/>
+          <w:numId w:val="5"/>
+        </w:numPr>
+      </w:pPr>
+      <w:r>
+        <w:t>No 3D visualization will be included—only 2D blueprint generation is required.</w:t>
+      </w:r>
+    </w:p>
+    <w:p>
+      <w:pPr>
+        <w:rPr>
+          <w:b/>
+          <w:bCs/>
+        </w:rPr>
+      </w:pPr>
+      <w:r>
+        <w:rPr>
+          <w:b/>
+          <w:bCs/>
+        </w:rPr>
+        <w:t>2.5. Assumptions and Dependencies</w:t>
+      </w:r>
+    </w:p>
+    <w:p>
+      <w:pPr>
+        <w:numPr>
+          <w:ilvl w:val="0"/>
+          <w:numId w:val="6"/>
+        </w:numPr>
+      </w:pPr>
+      <w:r>
+        <w:t>The user has basic knowledge of water tank design principles.</w:t>
+      </w:r>
+    </w:p>
+    <w:p>
+      <w:pPr>
+        <w:numPr>
+          <w:ilvl w:val="0"/>
+          <w:numId w:val="6"/>
+        </w:numPr>
+      </w:pPr>
+      <w:r>
+        <w:t>The software will follow the MIT License for open-source usage and development.</w:t>
+      </w:r>
+    </w:p>
+    <w:p>
+      <w:pPr>
+        <w:rPr>
+          <w:b/>
+          <w:bCs/>
+        </w:rPr>
+      </w:pPr>
+      <w:r>
+        <w:rPr>
+          <w:b/>
+          <w:bCs/>
+        </w:rPr>
+        <w:pict w14:anchorId="5A8E7723">
+          <v:rect id="_x0000_i1069" style="width:0;height:1.5pt" o:hralign="center" o:hrstd="t" o:hr="t" fillcolor="#a0a0a0" stroked="f"/>
+        </w:pict>
+      </w:r>
+    </w:p>
+    <w:p>
+      <w:pPr>
+        <w:rPr>
+          <w:b/>
+          <w:bCs/>
+        </w:rPr>
+      </w:pPr>
+      <w:r>
+        <w:rPr>
+          <w:b/>
+          <w:bCs/>
+        </w:rPr>
+        <w:t>3. Functional Requirements</w:t>
+      </w:r>
+    </w:p>
+    <w:p>
+      <w:pPr>
+        <w:rPr>
+          <w:b/>
+          <w:bCs/>
+        </w:rPr>
+      </w:pPr>
+      <w:r>
+        <w:rPr>
+          <w:b/>
+          <w:bCs/>
+        </w:rPr>
+        <w:t>3.1. Design Input Parameters</w:t>
+      </w:r>
+    </w:p>
+    <w:p>
+      <w:pPr>
+        <w:numPr>
+          <w:ilvl w:val="0"/>
+          <w:numId w:val="7"/>
+        </w:numPr>
+        <w:rPr>
+          <w:b/>
+          <w:bCs/>
+        </w:rPr>
+      </w:pPr>
+      <w:r>
+        <w:rPr>
+          <w:b/>
+          <w:bCs/>
+        </w:rPr>
+        <w:t>Users will be required to input:</w:t>
+      </w:r>
+    </w:p>
+    <w:p>
+      <w:pPr>
+        <w:numPr>
+          <w:ilvl w:val="1"/>
+          <w:numId w:val="7"/>
+        </w:numPr>
+        <w:rPr>
+          <w:b/>
+          <w:bCs/>
+        </w:rPr>
+      </w:pPr>
+      <w:r>
+        <w:rPr>
+          <w:b/>
+          <w:bCs/>
+        </w:rPr>
+        <w:t xml:space="preserve">Tank Dimensions: </w:t>
+      </w:r>
+      <w:r>
+        <w:t>Height of the tank, radius of the spherical top, and the diameter of the pedestal column</w:t>
+      </w:r>
+      <w:r>
+        <w:rPr>
+          <w:b/>
+          <w:bCs/>
+        </w:rPr>
+        <w:t>.</w:t>
+      </w:r>
+    </w:p>
+    <w:p>
+      <w:pPr>
+        <w:numPr>
+          <w:ilvl w:val="1"/>
+          <w:numId w:val="7"/>
+        </w:numPr>
+      </w:pPr>
+      <w:r>
+        <w:rPr>
+          <w:b/>
+          <w:bCs/>
+        </w:rPr>
+        <w:lastRenderedPageBreak/>
+        <w:t xml:space="preserve">Material Properties: </w:t>
+      </w:r>
+      <w:r>
+        <w:t>Material type (e.g., concrete, steel) and relevant physical properties (e.g., density, strength).</w:t>
+      </w:r>
+    </w:p>
+    <w:p>
+      <w:pPr>
+        <w:numPr>
+          <w:ilvl w:val="1"/>
+          <w:numId w:val="7"/>
+        </w:numPr>
+      </w:pPr>
+      <w:r>
+        <w:rPr>
+          <w:b/>
+          <w:bCs/>
+        </w:rPr>
+        <w:t xml:space="preserve">Load Conditions: </w:t>
+      </w:r>
+      <w:r>
+        <w:t>Environmental load inputs such as wind speed and seismic conditions.</w:t>
+      </w:r>
+    </w:p>
+    <w:p>
+      <w:pPr>
+        <w:rPr>
+          <w:b/>
+          <w:bCs/>
+        </w:rPr>
+      </w:pPr>
+      <w:r>
+        <w:rPr>
+          <w:b/>
+          <w:bCs/>
+        </w:rPr>
+        <w:t>3.2. Structural Analysis</w:t>
+      </w:r>
+    </w:p>
+    <w:p>
+      <w:pPr>
+        <w:numPr>
+          <w:ilvl w:val="0"/>
+          <w:numId w:val="8"/>
+        </w:numPr>
+        <w:rPr>
+          <w:b/>
+          <w:bCs/>
+        </w:rPr>
+      </w:pPr>
+      <w:r>
+        <w:rPr>
+          <w:b/>
+          <w:bCs/>
+        </w:rPr>
+        <w:t>The tool will calculate:</w:t>
+      </w:r>
+    </w:p>
+    <w:p>
+      <w:pPr>
+        <w:numPr>
+          <w:ilvl w:val="1"/>
+          <w:numId w:val="8"/>
+        </w:numPr>
+        <w:rPr>
+          <w:b/>
+          <w:bCs/>
+        </w:rPr>
+      </w:pPr>
+      <w:r>
+        <w:rPr>
+          <w:b/>
+          <w:bCs/>
+        </w:rPr>
+        <w:t xml:space="preserve">Water Pressure: </w:t>
+      </w:r>
+      <w:r>
+        <w:t>Based on tank dimensions and fluid density.</w:t>
+      </w:r>
+    </w:p>
+    <w:p>
+      <w:pPr>
+        <w:numPr>
+          <w:ilvl w:val="1"/>
+          <w:numId w:val="8"/>
+        </w:numPr>
+      </w:pPr>
+      <w:r>
+        <w:rPr>
+          <w:b/>
+          <w:bCs/>
+        </w:rPr>
+        <w:t xml:space="preserve">Wind Load: </w:t>
+      </w:r>
+      <w:r>
+        <w:t>According to user-specified wind speed.</w:t>
+      </w:r>
+    </w:p>
+    <w:p>
+      <w:pPr>
+        <w:numPr>
+          <w:ilvl w:val="1"/>
+          <w:numId w:val="8"/>
+        </w:numPr>
+      </w:pPr>
+      <w:r>
+        <w:rPr>
+          <w:b/>
+          <w:bCs/>
+        </w:rPr>
+        <w:t xml:space="preserve">Seismic Load: </w:t>
+      </w:r>
+      <w:r>
+        <w:t>As per regional standards if seismic activity is considered.</w:t>
+      </w:r>
+    </w:p>
+    <w:p>
+      <w:pPr>
+        <w:numPr>
+          <w:ilvl w:val="1"/>
+          <w:numId w:val="8"/>
+        </w:numPr>
+      </w:pPr>
+      <w:r>
+        <w:rPr>
+          <w:b/>
+          <w:bCs/>
+        </w:rPr>
+        <w:t xml:space="preserve">Stress and Stability Analysis: </w:t>
+      </w:r>
+      <w:r>
+        <w:t>Check for stress in the pedestal, tank shell, and spherical top using standard calculations.</w:t>
+      </w:r>
+    </w:p>
+    <w:p>
+      <w:pPr>
+        <w:rPr>
+          <w:b/>
+          <w:bCs/>
+        </w:rPr>
+      </w:pPr>
+      <w:r>
+        <w:rPr>
+          <w:b/>
+          <w:bCs/>
+        </w:rPr>
+        <w:t>3.3. 2D Blueprint Generation</w:t>
+      </w:r>
+    </w:p>
+    <w:p>
+      <w:pPr>
+        <w:numPr>
+          <w:ilvl w:val="0"/>
+          <w:numId w:val="9"/>
+        </w:numPr>
+      </w:pPr>
+      <w:r>
+        <w:t>The tool will output a 2D schematic of the water tank design, which includes:</w:t>
+      </w:r>
+    </w:p>
+    <w:p>
+      <w:pPr>
+        <w:numPr>
+          <w:ilvl w:val="1"/>
+          <w:numId w:val="9"/>
+        </w:numPr>
+      </w:pPr>
+      <w:r>
+        <w:t>Cross-sectional view of the tank with labels for key dimensions.</w:t>
+      </w:r>
+    </w:p>
+    <w:p>
+      <w:pPr>
+        <w:numPr>
+          <w:ilvl w:val="1"/>
+          <w:numId w:val="9"/>
+        </w:numPr>
+      </w:pPr>
+      <w:r>
+        <w:t>Dimensions of the pedestal column and spherical top.</w:t>
+      </w:r>
+    </w:p>
+    <w:p>
+      <w:pPr>
+        <w:numPr>
+          <w:ilvl w:val="1"/>
+          <w:numId w:val="9"/>
+        </w:numPr>
+      </w:pPr>
+      <w:r>
+        <w:t>Annotations for load points and stress concentration areas.</w:t>
+      </w:r>
+    </w:p>
+    <w:p>
+      <w:pPr>
+        <w:numPr>
+          <w:ilvl w:val="0"/>
+          <w:numId w:val="9"/>
+        </w:numPr>
+        <w:rPr>
+          <w:b/>
+          <w:bCs/>
+        </w:rPr>
+      </w:pPr>
+      <w:r>
+        <w:rPr>
+          <w:b/>
+          <w:bCs/>
+        </w:rPr>
+        <w:t>The blueprint will be exportable as a PDF or DXF format.</w:t>
+      </w:r>
+    </w:p>
+    <w:p>
+      <w:pPr>
+        <w:rPr>
+          <w:b/>
+          <w:bCs/>
+        </w:rPr>
+      </w:pPr>
+      <w:r>
+        <w:rPr>
+          <w:b/>
+          <w:bCs/>
+        </w:rPr>
+        <w:t>3.4. Report Generation</w:t>
+      </w:r>
+    </w:p>
+    <w:p>
+      <w:pPr>
+        <w:numPr>
+          <w:ilvl w:val="0"/>
+          <w:numId w:val="10"/>
+        </w:numPr>
+      </w:pPr>
+      <w:r>
+        <w:t>A detailed report will be generated, including:</w:t>
+      </w:r>
+    </w:p>
+    <w:p>
+      <w:pPr>
+        <w:numPr>
+          <w:ilvl w:val="1"/>
+          <w:numId w:val="10"/>
+        </w:numPr>
+      </w:pPr>
+      <w:r>
+        <w:t>Input Parameters Summary: All user inputs such as dimensions, materials, and load conditions.</w:t>
+      </w:r>
+    </w:p>
+    <w:p>
+      <w:pPr>
+        <w:numPr>
+          <w:ilvl w:val="1"/>
+          <w:numId w:val="10"/>
+        </w:numPr>
+      </w:pPr>
+      <w:r>
+        <w:t>Load Analysis: Detailed breakdown of wind, seismic, and water pressure loads.</w:t>
+      </w:r>
+    </w:p>
+    <w:p>
+      <w:pPr>
+        <w:numPr>
+          <w:ilvl w:val="1"/>
+          <w:numId w:val="10"/>
+        </w:numPr>
+      </w:pPr>
+      <w:r>
+        <w:t>Stress Analysis: Results showing whether the design meets the required safety standards.</w:t>
+      </w:r>
+    </w:p>
+    <w:p>
+      <w:pPr>
+        <w:numPr>
+          <w:ilvl w:val="1"/>
+          <w:numId w:val="10"/>
+        </w:numPr>
+      </w:pPr>
+      <w:r>
+        <w:t>Material Quantities: Estimated material requirements for the design.</w:t>
+      </w:r>
+    </w:p>
+    <w:p>
+      <w:pPr>
+        <w:rPr>
+          <w:b/>
+          <w:bCs/>
+        </w:rPr>
+      </w:pPr>
+      <w:r>
+        <w:rPr>
+          <w:b/>
+          <w:bCs/>
+        </w:rPr>
+        <w:t>3.5. User Interface (UI)</w:t>
+      </w:r>
+    </w:p>
+    <w:p>
+      <w:pPr>
+        <w:numPr>
+          <w:ilvl w:val="0"/>
+          <w:numId w:val="11"/>
+        </w:numPr>
+        <w:rPr>
+          <w:b/>
+          <w:bCs/>
+        </w:rPr>
+      </w:pPr>
+      <w:r>
+        <w:rPr>
+          <w:b/>
+          <w:bCs/>
+        </w:rPr>
+        <w:t>The UI will feature:</w:t>
+      </w:r>
+    </w:p>
+    <w:p>
+      <w:pPr>
+        <w:numPr>
+          <w:ilvl w:val="1"/>
+          <w:numId w:val="11"/>
+        </w:numPr>
+      </w:pPr>
+      <w:r>
+        <w:lastRenderedPageBreak/>
+        <w:t>Input Fields: For tank dimensions, material selection, and environmental conditions.</w:t>
+      </w:r>
+    </w:p>
+    <w:p>
+      <w:pPr>
+        <w:numPr>
+          <w:ilvl w:val="1"/>
+          <w:numId w:val="11"/>
+        </w:numPr>
+      </w:pPr>
+      <w:r>
+        <w:t>Run Analysis: Button to start the structural analysis.</w:t>
+      </w:r>
+    </w:p>
+    <w:p>
+      <w:pPr>
+        <w:numPr>
+          <w:ilvl w:val="1"/>
+          <w:numId w:val="11"/>
+        </w:numPr>
+      </w:pPr>
+      <w:r>
+        <w:t>View Results: Button to view the 2D schematic and report.</w:t>
+      </w:r>
+    </w:p>
+    <w:p>
+      <w:pPr>
+        <w:numPr>
+          <w:ilvl w:val="1"/>
+          <w:numId w:val="11"/>
+        </w:numPr>
+      </w:pPr>
+      <w:r>
+        <w:t>Menu Options: For saving, exporting, and modifying designs.</w:t>
+      </w:r>
+    </w:p>
+    <w:p>
+      <w:pPr>
+        <w:rPr>
+          <w:b/>
+          <w:bCs/>
+        </w:rPr>
+      </w:pPr>
+      <w:r>
+        <w:rPr>
+          <w:b/>
+          <w:bCs/>
+        </w:rPr>
+        <w:pict w14:anchorId="267D5102">
+          <v:rect id="_x0000_i1070" style="width:0;height:1.5pt" o:hralign="center" o:hrstd="t" o:hr="t" fillcolor="#a0a0a0" stroked="f"/>
+        </w:pict>
+      </w:r>
+    </w:p>
+    <w:p>
+      <w:pPr>
+        <w:rPr>
+          <w:b/>
+          <w:bCs/>
+        </w:rPr>
+      </w:pPr>
+      <w:r>
+        <w:rPr>
+          <w:b/>
+          <w:bCs/>
+        </w:rPr>
+        <w:t>4. Non-functional Requirements</w:t>
+      </w:r>
+    </w:p>
+    <w:p>
+      <w:pPr>
+        <w:rPr>
+          <w:b/>
+          <w:bCs/>
+        </w:rPr>
+      </w:pPr>
+      <w:r>
+        <w:rPr>
+          <w:b/>
+          <w:bCs/>
+        </w:rPr>
+        <w:t>4.1. Performance</w:t>
+      </w:r>
+    </w:p>
+    <w:p>
+      <w:pPr>
+        <w:numPr>
+          <w:ilvl w:val="0"/>
+          <w:numId w:val="12"/>
+        </w:numPr>
+      </w:pPr>
+      <w:r>
+        <w:t>The structural analysis should be completed within 5 seconds for typical designs.</w:t>
+      </w:r>
+    </w:p>
+    <w:p>
+      <w:pPr>
+        <w:numPr>
+          <w:ilvl w:val="0"/>
+          <w:numId w:val="12"/>
+        </w:numPr>
+      </w:pPr>
+      <w:r>
+        <w:t>2D blueprint generation should take no more than 3 seconds after analysis.</w:t>
+      </w:r>
+    </w:p>
+    <w:p>
+      <w:pPr>
+        <w:rPr>
+          <w:b/>
+          <w:bCs/>
+        </w:rPr>
+      </w:pPr>
+      <w:r>
+        <w:rPr>
+          <w:b/>
+          <w:bCs/>
+        </w:rPr>
+        <w:t>4.2. Usability</w:t>
+      </w:r>
+    </w:p>
+    <w:p>
+      <w:pPr>
+        <w:numPr>
+          <w:ilvl w:val="0"/>
+          <w:numId w:val="13"/>
+        </w:numPr>
+      </w:pPr>
+      <w:r>
+        <w:t>The tool will feature a user-friendly interface with tooltips and clear labeling, making it accessible to both novice and experienced users.</w:t>
+      </w:r>
+    </w:p>
+    <w:p>
+      <w:pPr>
+        <w:rPr>
+          <w:b/>
+          <w:bCs/>
+        </w:rPr>
+      </w:pPr>
+      <w:r>
+        <w:rPr>
+          <w:b/>
+          <w:bCs/>
+        </w:rPr>
+        <w:t>4.3. Reliability</w:t>
+      </w:r>
+    </w:p>
+    <w:p>
+      <w:pPr>
+        <w:numPr>
+          <w:ilvl w:val="0"/>
+          <w:numId w:val="14"/>
+        </w:numPr>
+      </w:pPr>
+      <w:r>
+        <w:t>The software will have minimal downtime, with over 99% reliability in processing inputs and generating results.</w:t>
+      </w:r>
+    </w:p>
+    <w:p>
+      <w:pPr>
+        <w:rPr>
+          <w:b/>
+          <w:bCs/>
+        </w:rPr>
+      </w:pPr>
+      <w:r>
+        <w:rPr>
+          <w:b/>
+          <w:bCs/>
+        </w:rPr>
+        <w:t>4.4. Licensing</w:t>
+      </w:r>
+    </w:p>
+    <w:p>
+      <w:pPr>
+        <w:numPr>
+          <w:ilvl w:val="0"/>
+          <w:numId w:val="15"/>
+        </w:numPr>
+      </w:pPr>
+      <w:r>
+        <w:t>The tool and its source code will be licensed under the MIT License, allowing for free usage, modification, and distribution.</w:t>
+      </w:r>
+    </w:p>
+    <w:p>
+      <w:pPr>
+        <w:rPr>
+          <w:b/>
+          <w:bCs/>
+        </w:rPr>
+      </w:pPr>
+      <w:r>
+        <w:rPr>
+          <w:b/>
+          <w:bCs/>
+        </w:rPr>
+        <w:t>4.5. Security</w:t>
+      </w:r>
+    </w:p>
+    <w:p>
+      <w:pPr>
+        <w:numPr>
+          <w:ilvl w:val="0"/>
+          <w:numId w:val="16"/>
+        </w:numPr>
+      </w:pPr>
+      <w:r>
+        <w:t>As the tool is a desktop application, no user data will be stored or transmitted over the internet.</w:t>
+      </w:r>
+    </w:p>
+    <w:p>
+      <w:pPr>
+        <w:rPr>
+          <w:b/>
+          <w:bCs/>
+        </w:rPr>
+      </w:pPr>
+      <w:r>
+        <w:rPr>
+          <w:b/>
+          <w:bCs/>
+        </w:rPr>
+        <w:pict w14:anchorId="309984A8">
+          <v:rect id="_x0000_i1071" style="width:0;height:1.5pt" o:hralign="center" o:hrstd="t" o:hr="t" fillcolor="#a0a0a0" stroked="f"/>
+        </w:pict>
+      </w:r>
+    </w:p>
+    <w:p>
+      <w:pPr>
+        <w:rPr>
+          <w:b/>
+          <w:bCs/>
+        </w:rPr>
+      </w:pPr>
+      <w:r>
+        <w:rPr>
+          <w:b/>
+          <w:bCs/>
+        </w:rPr>
+        <w:t>5. External Interface Requirements</w:t>
+      </w:r>
+    </w:p>
+    <w:p>
+      <w:pPr>
+        <w:rPr>
+          <w:b/>
+          <w:bCs/>
+        </w:rPr>
+      </w:pPr>
+      <w:r>
+        <w:rPr>
+          <w:b/>
+          <w:bCs/>
+        </w:rPr>
+        <w:t>5.1. User Interfaces</w:t>
+      </w:r>
+    </w:p>
+    <w:p>
+      <w:pPr>
+        <w:numPr>
+          <w:ilvl w:val="0"/>
+          <w:numId w:val="17"/>
+        </w:numPr>
+      </w:pPr>
+      <w:r>
+        <w:t>Main Input Screen: Will have fields for entering dimensions, material properties, and load conditions.</w:t>
+      </w:r>
+    </w:p>
+    <w:p>
+      <w:pPr>
+        <w:numPr>
+          <w:ilvl w:val="0"/>
+          <w:numId w:val="17"/>
+        </w:numPr>
+      </w:pPr>
+      <w:r>
+        <w:t>Results Screen: Display the 2D blueprint and report.</w:t>
+      </w:r>
+    </w:p>
+    <w:p>
+      <w:pPr>
+        <w:rPr>
+          <w:b/>
+          <w:bCs/>
+        </w:rPr>
+      </w:pPr>
+      <w:r>
+        <w:rPr>
+          <w:b/>
+          <w:bCs/>
+        </w:rPr>
+        <w:lastRenderedPageBreak/>
+        <w:t>5.2. Software Interfaces</w:t>
+      </w:r>
+    </w:p>
+    <w:p>
+      <w:pPr>
+        <w:numPr>
+          <w:ilvl w:val="0"/>
+          <w:numId w:val="18"/>
+        </w:numPr>
+      </w:pPr>
+      <w:r>
+        <w:t>The tool will use open-source libraries for handling mathematical calculations and 2D rendering.</w:t>
+      </w:r>
+    </w:p>
+    <w:p>
+      <w:pPr>
+        <w:rPr>
+          <w:b/>
+          <w:bCs/>
+        </w:rPr>
+      </w:pPr>
+      <w:r>
+        <w:rPr>
+          <w:b/>
+          <w:bCs/>
+        </w:rPr>
+        <w:t>5.3. Hardware Interfaces</w:t>
+      </w:r>
+    </w:p>
+    <w:p>
+      <w:pPr>
+        <w:numPr>
+          <w:ilvl w:val="0"/>
+          <w:numId w:val="19"/>
+        </w:numPr>
+      </w:pPr>
+      <w:r>
+        <w:t>The tool must run on standard desktop systems with:</w:t>
+      </w:r>
+    </w:p>
+    <w:p>
+      <w:pPr>
+        <w:numPr>
+          <w:ilvl w:val="1"/>
+          <w:numId w:val="19"/>
+        </w:numPr>
+      </w:pPr>
+      <w:r>
+        <w:t>CPU: 1 GHz or faster processor</w:t>
+      </w:r>
+    </w:p>
+    <w:p>
+      <w:pPr>
+        <w:numPr>
+          <w:ilvl w:val="1"/>
+          <w:numId w:val="19"/>
+        </w:numPr>
+      </w:pPr>
+      <w:r>
+        <w:t>RAM: 2 GB minimum</w:t>
+      </w:r>
+    </w:p>
+    <w:p>
+      <w:pPr>
+        <w:numPr>
+          <w:ilvl w:val="1"/>
+          <w:numId w:val="19"/>
+        </w:numPr>
+      </w:pPr>
+      <w:r>
+        <w:t>Disk Space: 100 MB available</w:t>
+      </w:r>
+    </w:p>
+    <w:p>
+      <w:pPr>
+        <w:rPr>
+          <w:b/>
+          <w:bCs/>
+        </w:rPr>
+      </w:pPr>
+      <w:r>
+        <w:rPr>
+          <w:b/>
+          <w:bCs/>
+        </w:rPr>
+        <w:pict w14:anchorId="0C82ED16">
+          <v:rect id="_x0000_i1072" style="width:0;height:1.5pt" o:hralign="center" o:hrstd="t" o:hr="t" fillcolor="#a0a0a0" stroked="f"/>
+        </w:pict>
+      </w:r>
+    </w:p>
+    <w:p>
+      <w:pPr>
+        <w:rPr>
+          <w:b/>
+          <w:bCs/>
+        </w:rPr>
+      </w:pPr>
+      <w:r>
+        <w:rPr>
+          <w:b/>
+          <w:bCs/>
+        </w:rPr>
+        <w:t>6. System Features</w:t>
+      </w:r>
+    </w:p>
     <w:tbl>
       <w:tblPr>
         <w:tblW w:w="0" w:type="auto"/>
@@ -30,17 +1406,7 @@
             <w:hideMark/>
           </w:tcPr>
           <w:p>
-            <w:pPr>
-              <w:rPr>
-                <w:b/>
-                <w:bCs/>
-              </w:rPr>
-            </w:pPr>
             <w:r>
-              <w:rPr>
-                <w:b/>
-                <w:bCs/>
-              </w:rPr>
               <w:t>Feature</w:t>
             </w:r>
           </w:p>
@@ -52,17 +1418,7 @@
             <w:hideMark/>
           </w:tcPr>
           <w:p>
-            <w:pPr>
-              <w:rPr>
-                <w:b/>
-                <w:bCs/>
-              </w:rPr>
-            </w:pPr>
             <w:r>
-              <w:rPr>
-                <w:b/>
-                <w:bCs/>
-              </w:rPr>
               <w:t>Description</w:t>
             </w:r>
           </w:p>
@@ -219,6 +1575,90 @@
         </w:tc>
       </w:tr>
     </w:tbl>
+    <w:p>
+      <w:pPr>
+        <w:rPr>
+          <w:b/>
+          <w:bCs/>
+        </w:rPr>
+      </w:pPr>
+      <w:r>
+        <w:rPr>
+          <w:b/>
+          <w:bCs/>
+        </w:rPr>
+        <w:pict w14:anchorId="15CE267B">
+          <v:rect id="_x0000_i1073" style="width:0;height:1.5pt" o:hralign="center" o:hrstd="t" o:hr="t" fillcolor="#a0a0a0" stroked="f"/>
+        </w:pict>
+      </w:r>
+    </w:p>
+    <w:p>
+      <w:pPr>
+        <w:rPr>
+          <w:b/>
+          <w:bCs/>
+        </w:rPr>
+      </w:pPr>
+      <w:r>
+        <w:rPr>
+          <w:b/>
+          <w:bCs/>
+        </w:rPr>
+        <w:t>7. Other Non-functional Requirements</w:t>
+      </w:r>
+    </w:p>
+    <w:p>
+      <w:pPr>
+        <w:rPr>
+          <w:b/>
+          <w:bCs/>
+        </w:rPr>
+      </w:pPr>
+      <w:r>
+        <w:rPr>
+          <w:b/>
+          <w:bCs/>
+        </w:rPr>
+        <w:t>7.1. Maintainability</w:t>
+      </w:r>
+    </w:p>
+    <w:p>
+      <w:pPr>
+        <w:numPr>
+          <w:ilvl w:val="0"/>
+          <w:numId w:val="20"/>
+        </w:numPr>
+      </w:pPr>
+      <w:r>
+        <w:t>The code will follow a modular design to allow easy updates and bug fixes.</w:t>
+      </w:r>
+    </w:p>
+    <w:p>
+      <w:pPr>
+        <w:rPr>
+          <w:b/>
+          <w:bCs/>
+        </w:rPr>
+      </w:pPr>
+      <w:r>
+        <w:rPr>
+          <w:b/>
+          <w:bCs/>
+        </w:rPr>
+        <w:t>7.2. Portability</w:t>
+      </w:r>
+    </w:p>
+    <w:p>
+      <w:pPr>
+        <w:numPr>
+          <w:ilvl w:val="0"/>
+          <w:numId w:val="21"/>
+        </w:numPr>
+      </w:pPr>
+      <w:r>
+        <w:t>The application will initially target Windows, but future versions could be ported to other platforms if necessary.</w:t>
+      </w:r>
+    </w:p>
     <w:p/>
     <w:sectPr>
       <w:pgSz w:w="12240" w:h="15840"/>
@@ -228,6 +1668,3203 @@
     </w:sectPr>
   </w:body>
 </w:document>
+</file>
+
+<file path=word/numbering.xml><?xml version="1.0" encoding="utf-8"?>
+<w:numbering xmlns:wpc="http://schemas.microsoft.com/office/word/2010/wordprocessingCanvas" xmlns:cx="http://schemas.microsoft.com/office/drawing/2014/chartex" xmlns:cx1="http://schemas.microsoft.com/office/drawing/2015/9/8/chartex" xmlns:cx2="http://schemas.microsoft.com/office/drawing/2015/10/21/chartex" xmlns:cx3="http://schemas.microsoft.com/office/drawing/2016/5/9/chartex" xmlns:cx4="http://schemas.microsoft.com/office/drawing/2016/5/10/chartex" xmlns:cx5="http://schemas.microsoft.com/office/drawing/2016/5/11/chartex" xmlns:cx6="http://schemas.microsoft.com/office/drawing/2016/5/12/chartex" xmlns:cx7="http://schemas.microsoft.com/office/drawing/2016/5/13/chartex" xmlns:cx8="http://schemas.microsoft.com/office/drawing/2016/5/14/chartex" xmlns:mc="http://schemas.openxmlformats.org/markup-compatibility/2006" xmlns:aink="http://schemas.microsoft.com/office/drawing/2016/ink" xmlns:am3d="http://schemas.microsoft.com/office/drawing/2017/model3d" xmlns:o="urn:schemas-microsoft-com:office:office" xmlns:oel="http://schemas.microsoft.com/office/2019/extlst" xmlns:r="http://schemas.openxmlformats.org/officeDocument/2006/relationships" xmlns:m="http://schemas.openxmlformats.org/officeDocument/2006/math" xmlns:v="urn:schemas-microsoft-com:vml" xmlns:wp14="http://schemas.microsoft.com/office/word/2010/wordprocessingDrawing" xmlns:wp="http://schemas.openxmlformats.org/drawingml/2006/wordprocessingDrawing" xmlns:w10="urn:schemas-microsoft-com:office:word" xmlns:w="http://schemas.openxmlformats.org/wordprocessingml/2006/main" xmlns:w14="http://schemas.microsoft.com/office/word/2010/wordml" xmlns:w15="http://schemas.microsoft.com/office/word/2012/wordml" xmlns:w16cex="http://schemas.microsoft.com/office/word/2018/wordml/cex" xmlns:w16cid="http://schemas.microsoft.com/office/word/2016/wordml/cid" xmlns:w16="http://schemas.microsoft.com/office/word/2018/wordml" xmlns:w16du="http://schemas.microsoft.com/office/word/2023/wordml/word16du" xmlns:w16sdtdh="http://schemas.microsoft.com/office/word/2020/wordml/sdtdatahash" xmlns:w16se="http://schemas.microsoft.com/office/word/2015/wordml/symex" xmlns:wpg="http://schemas.microsoft.com/office/word/2010/wordprocessingGroup" xmlns:wpi="http://schemas.microsoft.com/office/word/2010/wordprocessingInk" xmlns:wne="http://schemas.microsoft.com/office/word/2006/wordml" xmlns:wps="http://schemas.microsoft.com/office/word/2010/wordprocessingShape" mc:Ignorable="w14 w15 w16se w16cid w16 w16cex w16sdtdh w16du wp14">
+  <w:abstractNum w:abstractNumId="0" w15:restartNumberingAfterBreak="0">
+    <w:nsid w:val="01375431"/>
+    <w:multiLevelType w:val="multilevel"/>
+    <w:tmpl w:val="47CE0A38"/>
+    <w:lvl w:ilvl="0">
+      <w:start w:val="1"/>
+      <w:numFmt w:val="bullet"/>
+      <w:lvlText w:val=""/>
+      <w:lvlJc w:val="left"/>
+      <w:pPr>
+        <w:tabs>
+          <w:tab w:val="num" w:pos="720"/>
+        </w:tabs>
+        <w:ind w:left="720" w:hanging="360"/>
+      </w:pPr>
+      <w:rPr>
+        <w:rFonts w:ascii="Symbol" w:hAnsi="Symbol" w:hint="default"/>
+        <w:sz w:val="20"/>
+      </w:rPr>
+    </w:lvl>
+    <w:lvl w:ilvl="1">
+      <w:start w:val="1"/>
+      <w:numFmt w:val="bullet"/>
+      <w:lvlText w:val="o"/>
+      <w:lvlJc w:val="left"/>
+      <w:pPr>
+        <w:tabs>
+          <w:tab w:val="num" w:pos="1440"/>
+        </w:tabs>
+        <w:ind w:left="1440" w:hanging="360"/>
+      </w:pPr>
+      <w:rPr>
+        <w:rFonts w:ascii="Courier New" w:hAnsi="Courier New" w:hint="default"/>
+        <w:sz w:val="20"/>
+      </w:rPr>
+    </w:lvl>
+    <w:lvl w:ilvl="2" w:tentative="1">
+      <w:start w:val="1"/>
+      <w:numFmt w:val="bullet"/>
+      <w:lvlText w:val=""/>
+      <w:lvlJc w:val="left"/>
+      <w:pPr>
+        <w:tabs>
+          <w:tab w:val="num" w:pos="2160"/>
+        </w:tabs>
+        <w:ind w:left="2160" w:hanging="360"/>
+      </w:pPr>
+      <w:rPr>
+        <w:rFonts w:ascii="Wingdings" w:hAnsi="Wingdings" w:hint="default"/>
+        <w:sz w:val="20"/>
+      </w:rPr>
+    </w:lvl>
+    <w:lvl w:ilvl="3" w:tentative="1">
+      <w:start w:val="1"/>
+      <w:numFmt w:val="bullet"/>
+      <w:lvlText w:val=""/>
+      <w:lvlJc w:val="left"/>
+      <w:pPr>
+        <w:tabs>
+          <w:tab w:val="num" w:pos="2880"/>
+        </w:tabs>
+        <w:ind w:left="2880" w:hanging="360"/>
+      </w:pPr>
+      <w:rPr>
+        <w:rFonts w:ascii="Wingdings" w:hAnsi="Wingdings" w:hint="default"/>
+        <w:sz w:val="20"/>
+      </w:rPr>
+    </w:lvl>
+    <w:lvl w:ilvl="4" w:tentative="1">
+      <w:start w:val="1"/>
+      <w:numFmt w:val="bullet"/>
+      <w:lvlText w:val=""/>
+      <w:lvlJc w:val="left"/>
+      <w:pPr>
+        <w:tabs>
+          <w:tab w:val="num" w:pos="3600"/>
+        </w:tabs>
+        <w:ind w:left="3600" w:hanging="360"/>
+      </w:pPr>
+      <w:rPr>
+        <w:rFonts w:ascii="Wingdings" w:hAnsi="Wingdings" w:hint="default"/>
+        <w:sz w:val="20"/>
+      </w:rPr>
+    </w:lvl>
+    <w:lvl w:ilvl="5" w:tentative="1">
+      <w:start w:val="1"/>
+      <w:numFmt w:val="bullet"/>
+      <w:lvlText w:val=""/>
+      <w:lvlJc w:val="left"/>
+      <w:pPr>
+        <w:tabs>
+          <w:tab w:val="num" w:pos="4320"/>
+        </w:tabs>
+        <w:ind w:left="4320" w:hanging="360"/>
+      </w:pPr>
+      <w:rPr>
+        <w:rFonts w:ascii="Wingdings" w:hAnsi="Wingdings" w:hint="default"/>
+        <w:sz w:val="20"/>
+      </w:rPr>
+    </w:lvl>
+    <w:lvl w:ilvl="6" w:tentative="1">
+      <w:start w:val="1"/>
+      <w:numFmt w:val="bullet"/>
+      <w:lvlText w:val=""/>
+      <w:lvlJc w:val="left"/>
+      <w:pPr>
+        <w:tabs>
+          <w:tab w:val="num" w:pos="5040"/>
+        </w:tabs>
+        <w:ind w:left="5040" w:hanging="360"/>
+      </w:pPr>
+      <w:rPr>
+        <w:rFonts w:ascii="Wingdings" w:hAnsi="Wingdings" w:hint="default"/>
+        <w:sz w:val="20"/>
+      </w:rPr>
+    </w:lvl>
+    <w:lvl w:ilvl="7" w:tentative="1">
+      <w:start w:val="1"/>
+      <w:numFmt w:val="bullet"/>
+      <w:lvlText w:val=""/>
+      <w:lvlJc w:val="left"/>
+      <w:pPr>
+        <w:tabs>
+          <w:tab w:val="num" w:pos="5760"/>
+        </w:tabs>
+        <w:ind w:left="5760" w:hanging="360"/>
+      </w:pPr>
+      <w:rPr>
+        <w:rFonts w:ascii="Wingdings" w:hAnsi="Wingdings" w:hint="default"/>
+        <w:sz w:val="20"/>
+      </w:rPr>
+    </w:lvl>
+    <w:lvl w:ilvl="8" w:tentative="1">
+      <w:start w:val="1"/>
+      <w:numFmt w:val="bullet"/>
+      <w:lvlText w:val=""/>
+      <w:lvlJc w:val="left"/>
+      <w:pPr>
+        <w:tabs>
+          <w:tab w:val="num" w:pos="6480"/>
+        </w:tabs>
+        <w:ind w:left="6480" w:hanging="360"/>
+      </w:pPr>
+      <w:rPr>
+        <w:rFonts w:ascii="Wingdings" w:hAnsi="Wingdings" w:hint="default"/>
+        <w:sz w:val="20"/>
+      </w:rPr>
+    </w:lvl>
+  </w:abstractNum>
+  <w:abstractNum w:abstractNumId="1" w15:restartNumberingAfterBreak="0">
+    <w:nsid w:val="0F251FA1"/>
+    <w:multiLevelType w:val="multilevel"/>
+    <w:tmpl w:val="2AB24ECE"/>
+    <w:lvl w:ilvl="0">
+      <w:start w:val="1"/>
+      <w:numFmt w:val="bullet"/>
+      <w:lvlText w:val=""/>
+      <w:lvlJc w:val="left"/>
+      <w:pPr>
+        <w:tabs>
+          <w:tab w:val="num" w:pos="720"/>
+        </w:tabs>
+        <w:ind w:left="720" w:hanging="360"/>
+      </w:pPr>
+      <w:rPr>
+        <w:rFonts w:ascii="Symbol" w:hAnsi="Symbol" w:hint="default"/>
+        <w:sz w:val="20"/>
+      </w:rPr>
+    </w:lvl>
+    <w:lvl w:ilvl="1">
+      <w:start w:val="1"/>
+      <w:numFmt w:val="bullet"/>
+      <w:lvlText w:val="o"/>
+      <w:lvlJc w:val="left"/>
+      <w:pPr>
+        <w:tabs>
+          <w:tab w:val="num" w:pos="1440"/>
+        </w:tabs>
+        <w:ind w:left="1440" w:hanging="360"/>
+      </w:pPr>
+      <w:rPr>
+        <w:rFonts w:ascii="Courier New" w:hAnsi="Courier New" w:hint="default"/>
+        <w:sz w:val="20"/>
+      </w:rPr>
+    </w:lvl>
+    <w:lvl w:ilvl="2" w:tentative="1">
+      <w:start w:val="1"/>
+      <w:numFmt w:val="bullet"/>
+      <w:lvlText w:val=""/>
+      <w:lvlJc w:val="left"/>
+      <w:pPr>
+        <w:tabs>
+          <w:tab w:val="num" w:pos="2160"/>
+        </w:tabs>
+        <w:ind w:left="2160" w:hanging="360"/>
+      </w:pPr>
+      <w:rPr>
+        <w:rFonts w:ascii="Wingdings" w:hAnsi="Wingdings" w:hint="default"/>
+        <w:sz w:val="20"/>
+      </w:rPr>
+    </w:lvl>
+    <w:lvl w:ilvl="3" w:tentative="1">
+      <w:start w:val="1"/>
+      <w:numFmt w:val="bullet"/>
+      <w:lvlText w:val=""/>
+      <w:lvlJc w:val="left"/>
+      <w:pPr>
+        <w:tabs>
+          <w:tab w:val="num" w:pos="2880"/>
+        </w:tabs>
+        <w:ind w:left="2880" w:hanging="360"/>
+      </w:pPr>
+      <w:rPr>
+        <w:rFonts w:ascii="Wingdings" w:hAnsi="Wingdings" w:hint="default"/>
+        <w:sz w:val="20"/>
+      </w:rPr>
+    </w:lvl>
+    <w:lvl w:ilvl="4" w:tentative="1">
+      <w:start w:val="1"/>
+      <w:numFmt w:val="bullet"/>
+      <w:lvlText w:val=""/>
+      <w:lvlJc w:val="left"/>
+      <w:pPr>
+        <w:tabs>
+          <w:tab w:val="num" w:pos="3600"/>
+        </w:tabs>
+        <w:ind w:left="3600" w:hanging="360"/>
+      </w:pPr>
+      <w:rPr>
+        <w:rFonts w:ascii="Wingdings" w:hAnsi="Wingdings" w:hint="default"/>
+        <w:sz w:val="20"/>
+      </w:rPr>
+    </w:lvl>
+    <w:lvl w:ilvl="5" w:tentative="1">
+      <w:start w:val="1"/>
+      <w:numFmt w:val="bullet"/>
+      <w:lvlText w:val=""/>
+      <w:lvlJc w:val="left"/>
+      <w:pPr>
+        <w:tabs>
+          <w:tab w:val="num" w:pos="4320"/>
+        </w:tabs>
+        <w:ind w:left="4320" w:hanging="360"/>
+      </w:pPr>
+      <w:rPr>
+        <w:rFonts w:ascii="Wingdings" w:hAnsi="Wingdings" w:hint="default"/>
+        <w:sz w:val="20"/>
+      </w:rPr>
+    </w:lvl>
+    <w:lvl w:ilvl="6" w:tentative="1">
+      <w:start w:val="1"/>
+      <w:numFmt w:val="bullet"/>
+      <w:lvlText w:val=""/>
+      <w:lvlJc w:val="left"/>
+      <w:pPr>
+        <w:tabs>
+          <w:tab w:val="num" w:pos="5040"/>
+        </w:tabs>
+        <w:ind w:left="5040" w:hanging="360"/>
+      </w:pPr>
+      <w:rPr>
+        <w:rFonts w:ascii="Wingdings" w:hAnsi="Wingdings" w:hint="default"/>
+        <w:sz w:val="20"/>
+      </w:rPr>
+    </w:lvl>
+    <w:lvl w:ilvl="7" w:tentative="1">
+      <w:start w:val="1"/>
+      <w:numFmt w:val="bullet"/>
+      <w:lvlText w:val=""/>
+      <w:lvlJc w:val="left"/>
+      <w:pPr>
+        <w:tabs>
+          <w:tab w:val="num" w:pos="5760"/>
+        </w:tabs>
+        <w:ind w:left="5760" w:hanging="360"/>
+      </w:pPr>
+      <w:rPr>
+        <w:rFonts w:ascii="Wingdings" w:hAnsi="Wingdings" w:hint="default"/>
+        <w:sz w:val="20"/>
+      </w:rPr>
+    </w:lvl>
+    <w:lvl w:ilvl="8" w:tentative="1">
+      <w:start w:val="1"/>
+      <w:numFmt w:val="bullet"/>
+      <w:lvlText w:val=""/>
+      <w:lvlJc w:val="left"/>
+      <w:pPr>
+        <w:tabs>
+          <w:tab w:val="num" w:pos="6480"/>
+        </w:tabs>
+        <w:ind w:left="6480" w:hanging="360"/>
+      </w:pPr>
+      <w:rPr>
+        <w:rFonts w:ascii="Wingdings" w:hAnsi="Wingdings" w:hint="default"/>
+        <w:sz w:val="20"/>
+      </w:rPr>
+    </w:lvl>
+  </w:abstractNum>
+  <w:abstractNum w:abstractNumId="2" w15:restartNumberingAfterBreak="0">
+    <w:nsid w:val="1BCD501C"/>
+    <w:multiLevelType w:val="multilevel"/>
+    <w:tmpl w:val="297CC34A"/>
+    <w:lvl w:ilvl="0">
+      <w:start w:val="1"/>
+      <w:numFmt w:val="bullet"/>
+      <w:lvlText w:val=""/>
+      <w:lvlJc w:val="left"/>
+      <w:pPr>
+        <w:tabs>
+          <w:tab w:val="num" w:pos="720"/>
+        </w:tabs>
+        <w:ind w:left="720" w:hanging="360"/>
+      </w:pPr>
+      <w:rPr>
+        <w:rFonts w:ascii="Symbol" w:hAnsi="Symbol" w:hint="default"/>
+        <w:sz w:val="20"/>
+      </w:rPr>
+    </w:lvl>
+    <w:lvl w:ilvl="1" w:tentative="1">
+      <w:start w:val="1"/>
+      <w:numFmt w:val="bullet"/>
+      <w:lvlText w:val="o"/>
+      <w:lvlJc w:val="left"/>
+      <w:pPr>
+        <w:tabs>
+          <w:tab w:val="num" w:pos="1440"/>
+        </w:tabs>
+        <w:ind w:left="1440" w:hanging="360"/>
+      </w:pPr>
+      <w:rPr>
+        <w:rFonts w:ascii="Courier New" w:hAnsi="Courier New" w:hint="default"/>
+        <w:sz w:val="20"/>
+      </w:rPr>
+    </w:lvl>
+    <w:lvl w:ilvl="2" w:tentative="1">
+      <w:start w:val="1"/>
+      <w:numFmt w:val="bullet"/>
+      <w:lvlText w:val=""/>
+      <w:lvlJc w:val="left"/>
+      <w:pPr>
+        <w:tabs>
+          <w:tab w:val="num" w:pos="2160"/>
+        </w:tabs>
+        <w:ind w:left="2160" w:hanging="360"/>
+      </w:pPr>
+      <w:rPr>
+        <w:rFonts w:ascii="Wingdings" w:hAnsi="Wingdings" w:hint="default"/>
+        <w:sz w:val="20"/>
+      </w:rPr>
+    </w:lvl>
+    <w:lvl w:ilvl="3" w:tentative="1">
+      <w:start w:val="1"/>
+      <w:numFmt w:val="bullet"/>
+      <w:lvlText w:val=""/>
+      <w:lvlJc w:val="left"/>
+      <w:pPr>
+        <w:tabs>
+          <w:tab w:val="num" w:pos="2880"/>
+        </w:tabs>
+        <w:ind w:left="2880" w:hanging="360"/>
+      </w:pPr>
+      <w:rPr>
+        <w:rFonts w:ascii="Wingdings" w:hAnsi="Wingdings" w:hint="default"/>
+        <w:sz w:val="20"/>
+      </w:rPr>
+    </w:lvl>
+    <w:lvl w:ilvl="4" w:tentative="1">
+      <w:start w:val="1"/>
+      <w:numFmt w:val="bullet"/>
+      <w:lvlText w:val=""/>
+      <w:lvlJc w:val="left"/>
+      <w:pPr>
+        <w:tabs>
+          <w:tab w:val="num" w:pos="3600"/>
+        </w:tabs>
+        <w:ind w:left="3600" w:hanging="360"/>
+      </w:pPr>
+      <w:rPr>
+        <w:rFonts w:ascii="Wingdings" w:hAnsi="Wingdings" w:hint="default"/>
+        <w:sz w:val="20"/>
+      </w:rPr>
+    </w:lvl>
+    <w:lvl w:ilvl="5" w:tentative="1">
+      <w:start w:val="1"/>
+      <w:numFmt w:val="bullet"/>
+      <w:lvlText w:val=""/>
+      <w:lvlJc w:val="left"/>
+      <w:pPr>
+        <w:tabs>
+          <w:tab w:val="num" w:pos="4320"/>
+        </w:tabs>
+        <w:ind w:left="4320" w:hanging="360"/>
+      </w:pPr>
+      <w:rPr>
+        <w:rFonts w:ascii="Wingdings" w:hAnsi="Wingdings" w:hint="default"/>
+        <w:sz w:val="20"/>
+      </w:rPr>
+    </w:lvl>
+    <w:lvl w:ilvl="6" w:tentative="1">
+      <w:start w:val="1"/>
+      <w:numFmt w:val="bullet"/>
+      <w:lvlText w:val=""/>
+      <w:lvlJc w:val="left"/>
+      <w:pPr>
+        <w:tabs>
+          <w:tab w:val="num" w:pos="5040"/>
+        </w:tabs>
+        <w:ind w:left="5040" w:hanging="360"/>
+      </w:pPr>
+      <w:rPr>
+        <w:rFonts w:ascii="Wingdings" w:hAnsi="Wingdings" w:hint="default"/>
+        <w:sz w:val="20"/>
+      </w:rPr>
+    </w:lvl>
+    <w:lvl w:ilvl="7" w:tentative="1">
+      <w:start w:val="1"/>
+      <w:numFmt w:val="bullet"/>
+      <w:lvlText w:val=""/>
+      <w:lvlJc w:val="left"/>
+      <w:pPr>
+        <w:tabs>
+          <w:tab w:val="num" w:pos="5760"/>
+        </w:tabs>
+        <w:ind w:left="5760" w:hanging="360"/>
+      </w:pPr>
+      <w:rPr>
+        <w:rFonts w:ascii="Wingdings" w:hAnsi="Wingdings" w:hint="default"/>
+        <w:sz w:val="20"/>
+      </w:rPr>
+    </w:lvl>
+    <w:lvl w:ilvl="8" w:tentative="1">
+      <w:start w:val="1"/>
+      <w:numFmt w:val="bullet"/>
+      <w:lvlText w:val=""/>
+      <w:lvlJc w:val="left"/>
+      <w:pPr>
+        <w:tabs>
+          <w:tab w:val="num" w:pos="6480"/>
+        </w:tabs>
+        <w:ind w:left="6480" w:hanging="360"/>
+      </w:pPr>
+      <w:rPr>
+        <w:rFonts w:ascii="Wingdings" w:hAnsi="Wingdings" w:hint="default"/>
+        <w:sz w:val="20"/>
+      </w:rPr>
+    </w:lvl>
+  </w:abstractNum>
+  <w:abstractNum w:abstractNumId="3" w15:restartNumberingAfterBreak="0">
+    <w:nsid w:val="1C6E5661"/>
+    <w:multiLevelType w:val="multilevel"/>
+    <w:tmpl w:val="2586E7AC"/>
+    <w:lvl w:ilvl="0">
+      <w:start w:val="1"/>
+      <w:numFmt w:val="bullet"/>
+      <w:lvlText w:val=""/>
+      <w:lvlJc w:val="left"/>
+      <w:pPr>
+        <w:tabs>
+          <w:tab w:val="num" w:pos="720"/>
+        </w:tabs>
+        <w:ind w:left="720" w:hanging="360"/>
+      </w:pPr>
+      <w:rPr>
+        <w:rFonts w:ascii="Symbol" w:hAnsi="Symbol" w:hint="default"/>
+        <w:sz w:val="20"/>
+      </w:rPr>
+    </w:lvl>
+    <w:lvl w:ilvl="1" w:tentative="1">
+      <w:start w:val="1"/>
+      <w:numFmt w:val="bullet"/>
+      <w:lvlText w:val="o"/>
+      <w:lvlJc w:val="left"/>
+      <w:pPr>
+        <w:tabs>
+          <w:tab w:val="num" w:pos="1440"/>
+        </w:tabs>
+        <w:ind w:left="1440" w:hanging="360"/>
+      </w:pPr>
+      <w:rPr>
+        <w:rFonts w:ascii="Courier New" w:hAnsi="Courier New" w:hint="default"/>
+        <w:sz w:val="20"/>
+      </w:rPr>
+    </w:lvl>
+    <w:lvl w:ilvl="2" w:tentative="1">
+      <w:start w:val="1"/>
+      <w:numFmt w:val="bullet"/>
+      <w:lvlText w:val=""/>
+      <w:lvlJc w:val="left"/>
+      <w:pPr>
+        <w:tabs>
+          <w:tab w:val="num" w:pos="2160"/>
+        </w:tabs>
+        <w:ind w:left="2160" w:hanging="360"/>
+      </w:pPr>
+      <w:rPr>
+        <w:rFonts w:ascii="Wingdings" w:hAnsi="Wingdings" w:hint="default"/>
+        <w:sz w:val="20"/>
+      </w:rPr>
+    </w:lvl>
+    <w:lvl w:ilvl="3" w:tentative="1">
+      <w:start w:val="1"/>
+      <w:numFmt w:val="bullet"/>
+      <w:lvlText w:val=""/>
+      <w:lvlJc w:val="left"/>
+      <w:pPr>
+        <w:tabs>
+          <w:tab w:val="num" w:pos="2880"/>
+        </w:tabs>
+        <w:ind w:left="2880" w:hanging="360"/>
+      </w:pPr>
+      <w:rPr>
+        <w:rFonts w:ascii="Wingdings" w:hAnsi="Wingdings" w:hint="default"/>
+        <w:sz w:val="20"/>
+      </w:rPr>
+    </w:lvl>
+    <w:lvl w:ilvl="4" w:tentative="1">
+      <w:start w:val="1"/>
+      <w:numFmt w:val="bullet"/>
+      <w:lvlText w:val=""/>
+      <w:lvlJc w:val="left"/>
+      <w:pPr>
+        <w:tabs>
+          <w:tab w:val="num" w:pos="3600"/>
+        </w:tabs>
+        <w:ind w:left="3600" w:hanging="360"/>
+      </w:pPr>
+      <w:rPr>
+        <w:rFonts w:ascii="Wingdings" w:hAnsi="Wingdings" w:hint="default"/>
+        <w:sz w:val="20"/>
+      </w:rPr>
+    </w:lvl>
+    <w:lvl w:ilvl="5" w:tentative="1">
+      <w:start w:val="1"/>
+      <w:numFmt w:val="bullet"/>
+      <w:lvlText w:val=""/>
+      <w:lvlJc w:val="left"/>
+      <w:pPr>
+        <w:tabs>
+          <w:tab w:val="num" w:pos="4320"/>
+        </w:tabs>
+        <w:ind w:left="4320" w:hanging="360"/>
+      </w:pPr>
+      <w:rPr>
+        <w:rFonts w:ascii="Wingdings" w:hAnsi="Wingdings" w:hint="default"/>
+        <w:sz w:val="20"/>
+      </w:rPr>
+    </w:lvl>
+    <w:lvl w:ilvl="6" w:tentative="1">
+      <w:start w:val="1"/>
+      <w:numFmt w:val="bullet"/>
+      <w:lvlText w:val=""/>
+      <w:lvlJc w:val="left"/>
+      <w:pPr>
+        <w:tabs>
+          <w:tab w:val="num" w:pos="5040"/>
+        </w:tabs>
+        <w:ind w:left="5040" w:hanging="360"/>
+      </w:pPr>
+      <w:rPr>
+        <w:rFonts w:ascii="Wingdings" w:hAnsi="Wingdings" w:hint="default"/>
+        <w:sz w:val="20"/>
+      </w:rPr>
+    </w:lvl>
+    <w:lvl w:ilvl="7" w:tentative="1">
+      <w:start w:val="1"/>
+      <w:numFmt w:val="bullet"/>
+      <w:lvlText w:val=""/>
+      <w:lvlJc w:val="left"/>
+      <w:pPr>
+        <w:tabs>
+          <w:tab w:val="num" w:pos="5760"/>
+        </w:tabs>
+        <w:ind w:left="5760" w:hanging="360"/>
+      </w:pPr>
+      <w:rPr>
+        <w:rFonts w:ascii="Wingdings" w:hAnsi="Wingdings" w:hint="default"/>
+        <w:sz w:val="20"/>
+      </w:rPr>
+    </w:lvl>
+    <w:lvl w:ilvl="8" w:tentative="1">
+      <w:start w:val="1"/>
+      <w:numFmt w:val="bullet"/>
+      <w:lvlText w:val=""/>
+      <w:lvlJc w:val="left"/>
+      <w:pPr>
+        <w:tabs>
+          <w:tab w:val="num" w:pos="6480"/>
+        </w:tabs>
+        <w:ind w:left="6480" w:hanging="360"/>
+      </w:pPr>
+      <w:rPr>
+        <w:rFonts w:ascii="Wingdings" w:hAnsi="Wingdings" w:hint="default"/>
+        <w:sz w:val="20"/>
+      </w:rPr>
+    </w:lvl>
+  </w:abstractNum>
+  <w:abstractNum w:abstractNumId="4" w15:restartNumberingAfterBreak="0">
+    <w:nsid w:val="1F9D7CC1"/>
+    <w:multiLevelType w:val="multilevel"/>
+    <w:tmpl w:val="7212A748"/>
+    <w:lvl w:ilvl="0">
+      <w:start w:val="1"/>
+      <w:numFmt w:val="bullet"/>
+      <w:lvlText w:val=""/>
+      <w:lvlJc w:val="left"/>
+      <w:pPr>
+        <w:tabs>
+          <w:tab w:val="num" w:pos="720"/>
+        </w:tabs>
+        <w:ind w:left="720" w:hanging="360"/>
+      </w:pPr>
+      <w:rPr>
+        <w:rFonts w:ascii="Symbol" w:hAnsi="Symbol" w:hint="default"/>
+        <w:sz w:val="20"/>
+      </w:rPr>
+    </w:lvl>
+    <w:lvl w:ilvl="1">
+      <w:start w:val="1"/>
+      <w:numFmt w:val="bullet"/>
+      <w:lvlText w:val="o"/>
+      <w:lvlJc w:val="left"/>
+      <w:pPr>
+        <w:tabs>
+          <w:tab w:val="num" w:pos="1440"/>
+        </w:tabs>
+        <w:ind w:left="1440" w:hanging="360"/>
+      </w:pPr>
+      <w:rPr>
+        <w:rFonts w:ascii="Courier New" w:hAnsi="Courier New" w:hint="default"/>
+        <w:sz w:val="20"/>
+      </w:rPr>
+    </w:lvl>
+    <w:lvl w:ilvl="2" w:tentative="1">
+      <w:start w:val="1"/>
+      <w:numFmt w:val="bullet"/>
+      <w:lvlText w:val=""/>
+      <w:lvlJc w:val="left"/>
+      <w:pPr>
+        <w:tabs>
+          <w:tab w:val="num" w:pos="2160"/>
+        </w:tabs>
+        <w:ind w:left="2160" w:hanging="360"/>
+      </w:pPr>
+      <w:rPr>
+        <w:rFonts w:ascii="Wingdings" w:hAnsi="Wingdings" w:hint="default"/>
+        <w:sz w:val="20"/>
+      </w:rPr>
+    </w:lvl>
+    <w:lvl w:ilvl="3" w:tentative="1">
+      <w:start w:val="1"/>
+      <w:numFmt w:val="bullet"/>
+      <w:lvlText w:val=""/>
+      <w:lvlJc w:val="left"/>
+      <w:pPr>
+        <w:tabs>
+          <w:tab w:val="num" w:pos="2880"/>
+        </w:tabs>
+        <w:ind w:left="2880" w:hanging="360"/>
+      </w:pPr>
+      <w:rPr>
+        <w:rFonts w:ascii="Wingdings" w:hAnsi="Wingdings" w:hint="default"/>
+        <w:sz w:val="20"/>
+      </w:rPr>
+    </w:lvl>
+    <w:lvl w:ilvl="4" w:tentative="1">
+      <w:start w:val="1"/>
+      <w:numFmt w:val="bullet"/>
+      <w:lvlText w:val=""/>
+      <w:lvlJc w:val="left"/>
+      <w:pPr>
+        <w:tabs>
+          <w:tab w:val="num" w:pos="3600"/>
+        </w:tabs>
+        <w:ind w:left="3600" w:hanging="360"/>
+      </w:pPr>
+      <w:rPr>
+        <w:rFonts w:ascii="Wingdings" w:hAnsi="Wingdings" w:hint="default"/>
+        <w:sz w:val="20"/>
+      </w:rPr>
+    </w:lvl>
+    <w:lvl w:ilvl="5" w:tentative="1">
+      <w:start w:val="1"/>
+      <w:numFmt w:val="bullet"/>
+      <w:lvlText w:val=""/>
+      <w:lvlJc w:val="left"/>
+      <w:pPr>
+        <w:tabs>
+          <w:tab w:val="num" w:pos="4320"/>
+        </w:tabs>
+        <w:ind w:left="4320" w:hanging="360"/>
+      </w:pPr>
+      <w:rPr>
+        <w:rFonts w:ascii="Wingdings" w:hAnsi="Wingdings" w:hint="default"/>
+        <w:sz w:val="20"/>
+      </w:rPr>
+    </w:lvl>
+    <w:lvl w:ilvl="6" w:tentative="1">
+      <w:start w:val="1"/>
+      <w:numFmt w:val="bullet"/>
+      <w:lvlText w:val=""/>
+      <w:lvlJc w:val="left"/>
+      <w:pPr>
+        <w:tabs>
+          <w:tab w:val="num" w:pos="5040"/>
+        </w:tabs>
+        <w:ind w:left="5040" w:hanging="360"/>
+      </w:pPr>
+      <w:rPr>
+        <w:rFonts w:ascii="Wingdings" w:hAnsi="Wingdings" w:hint="default"/>
+        <w:sz w:val="20"/>
+      </w:rPr>
+    </w:lvl>
+    <w:lvl w:ilvl="7" w:tentative="1">
+      <w:start w:val="1"/>
+      <w:numFmt w:val="bullet"/>
+      <w:lvlText w:val=""/>
+      <w:lvlJc w:val="left"/>
+      <w:pPr>
+        <w:tabs>
+          <w:tab w:val="num" w:pos="5760"/>
+        </w:tabs>
+        <w:ind w:left="5760" w:hanging="360"/>
+      </w:pPr>
+      <w:rPr>
+        <w:rFonts w:ascii="Wingdings" w:hAnsi="Wingdings" w:hint="default"/>
+        <w:sz w:val="20"/>
+      </w:rPr>
+    </w:lvl>
+    <w:lvl w:ilvl="8" w:tentative="1">
+      <w:start w:val="1"/>
+      <w:numFmt w:val="bullet"/>
+      <w:lvlText w:val=""/>
+      <w:lvlJc w:val="left"/>
+      <w:pPr>
+        <w:tabs>
+          <w:tab w:val="num" w:pos="6480"/>
+        </w:tabs>
+        <w:ind w:left="6480" w:hanging="360"/>
+      </w:pPr>
+      <w:rPr>
+        <w:rFonts w:ascii="Wingdings" w:hAnsi="Wingdings" w:hint="default"/>
+        <w:sz w:val="20"/>
+      </w:rPr>
+    </w:lvl>
+  </w:abstractNum>
+  <w:abstractNum w:abstractNumId="5" w15:restartNumberingAfterBreak="0">
+    <w:nsid w:val="215E5553"/>
+    <w:multiLevelType w:val="multilevel"/>
+    <w:tmpl w:val="510225F8"/>
+    <w:lvl w:ilvl="0">
+      <w:start w:val="1"/>
+      <w:numFmt w:val="bullet"/>
+      <w:lvlText w:val=""/>
+      <w:lvlJc w:val="left"/>
+      <w:pPr>
+        <w:tabs>
+          <w:tab w:val="num" w:pos="720"/>
+        </w:tabs>
+        <w:ind w:left="720" w:hanging="360"/>
+      </w:pPr>
+      <w:rPr>
+        <w:rFonts w:ascii="Symbol" w:hAnsi="Symbol" w:hint="default"/>
+        <w:sz w:val="20"/>
+      </w:rPr>
+    </w:lvl>
+    <w:lvl w:ilvl="1" w:tentative="1">
+      <w:start w:val="1"/>
+      <w:numFmt w:val="bullet"/>
+      <w:lvlText w:val="o"/>
+      <w:lvlJc w:val="left"/>
+      <w:pPr>
+        <w:tabs>
+          <w:tab w:val="num" w:pos="1440"/>
+        </w:tabs>
+        <w:ind w:left="1440" w:hanging="360"/>
+      </w:pPr>
+      <w:rPr>
+        <w:rFonts w:ascii="Courier New" w:hAnsi="Courier New" w:hint="default"/>
+        <w:sz w:val="20"/>
+      </w:rPr>
+    </w:lvl>
+    <w:lvl w:ilvl="2" w:tentative="1">
+      <w:start w:val="1"/>
+      <w:numFmt w:val="bullet"/>
+      <w:lvlText w:val=""/>
+      <w:lvlJc w:val="left"/>
+      <w:pPr>
+        <w:tabs>
+          <w:tab w:val="num" w:pos="2160"/>
+        </w:tabs>
+        <w:ind w:left="2160" w:hanging="360"/>
+      </w:pPr>
+      <w:rPr>
+        <w:rFonts w:ascii="Wingdings" w:hAnsi="Wingdings" w:hint="default"/>
+        <w:sz w:val="20"/>
+      </w:rPr>
+    </w:lvl>
+    <w:lvl w:ilvl="3" w:tentative="1">
+      <w:start w:val="1"/>
+      <w:numFmt w:val="bullet"/>
+      <w:lvlText w:val=""/>
+      <w:lvlJc w:val="left"/>
+      <w:pPr>
+        <w:tabs>
+          <w:tab w:val="num" w:pos="2880"/>
+        </w:tabs>
+        <w:ind w:left="2880" w:hanging="360"/>
+      </w:pPr>
+      <w:rPr>
+        <w:rFonts w:ascii="Wingdings" w:hAnsi="Wingdings" w:hint="default"/>
+        <w:sz w:val="20"/>
+      </w:rPr>
+    </w:lvl>
+    <w:lvl w:ilvl="4" w:tentative="1">
+      <w:start w:val="1"/>
+      <w:numFmt w:val="bullet"/>
+      <w:lvlText w:val=""/>
+      <w:lvlJc w:val="left"/>
+      <w:pPr>
+        <w:tabs>
+          <w:tab w:val="num" w:pos="3600"/>
+        </w:tabs>
+        <w:ind w:left="3600" w:hanging="360"/>
+      </w:pPr>
+      <w:rPr>
+        <w:rFonts w:ascii="Wingdings" w:hAnsi="Wingdings" w:hint="default"/>
+        <w:sz w:val="20"/>
+      </w:rPr>
+    </w:lvl>
+    <w:lvl w:ilvl="5" w:tentative="1">
+      <w:start w:val="1"/>
+      <w:numFmt w:val="bullet"/>
+      <w:lvlText w:val=""/>
+      <w:lvlJc w:val="left"/>
+      <w:pPr>
+        <w:tabs>
+          <w:tab w:val="num" w:pos="4320"/>
+        </w:tabs>
+        <w:ind w:left="4320" w:hanging="360"/>
+      </w:pPr>
+      <w:rPr>
+        <w:rFonts w:ascii="Wingdings" w:hAnsi="Wingdings" w:hint="default"/>
+        <w:sz w:val="20"/>
+      </w:rPr>
+    </w:lvl>
+    <w:lvl w:ilvl="6" w:tentative="1">
+      <w:start w:val="1"/>
+      <w:numFmt w:val="bullet"/>
+      <w:lvlText w:val=""/>
+      <w:lvlJc w:val="left"/>
+      <w:pPr>
+        <w:tabs>
+          <w:tab w:val="num" w:pos="5040"/>
+        </w:tabs>
+        <w:ind w:left="5040" w:hanging="360"/>
+      </w:pPr>
+      <w:rPr>
+        <w:rFonts w:ascii="Wingdings" w:hAnsi="Wingdings" w:hint="default"/>
+        <w:sz w:val="20"/>
+      </w:rPr>
+    </w:lvl>
+    <w:lvl w:ilvl="7" w:tentative="1">
+      <w:start w:val="1"/>
+      <w:numFmt w:val="bullet"/>
+      <w:lvlText w:val=""/>
+      <w:lvlJc w:val="left"/>
+      <w:pPr>
+        <w:tabs>
+          <w:tab w:val="num" w:pos="5760"/>
+        </w:tabs>
+        <w:ind w:left="5760" w:hanging="360"/>
+      </w:pPr>
+      <w:rPr>
+        <w:rFonts w:ascii="Wingdings" w:hAnsi="Wingdings" w:hint="default"/>
+        <w:sz w:val="20"/>
+      </w:rPr>
+    </w:lvl>
+    <w:lvl w:ilvl="8" w:tentative="1">
+      <w:start w:val="1"/>
+      <w:numFmt w:val="bullet"/>
+      <w:lvlText w:val=""/>
+      <w:lvlJc w:val="left"/>
+      <w:pPr>
+        <w:tabs>
+          <w:tab w:val="num" w:pos="6480"/>
+        </w:tabs>
+        <w:ind w:left="6480" w:hanging="360"/>
+      </w:pPr>
+      <w:rPr>
+        <w:rFonts w:ascii="Wingdings" w:hAnsi="Wingdings" w:hint="default"/>
+        <w:sz w:val="20"/>
+      </w:rPr>
+    </w:lvl>
+  </w:abstractNum>
+  <w:abstractNum w:abstractNumId="6" w15:restartNumberingAfterBreak="0">
+    <w:nsid w:val="2BC96F1B"/>
+    <w:multiLevelType w:val="multilevel"/>
+    <w:tmpl w:val="52700D42"/>
+    <w:lvl w:ilvl="0">
+      <w:start w:val="1"/>
+      <w:numFmt w:val="bullet"/>
+      <w:lvlText w:val=""/>
+      <w:lvlJc w:val="left"/>
+      <w:pPr>
+        <w:tabs>
+          <w:tab w:val="num" w:pos="720"/>
+        </w:tabs>
+        <w:ind w:left="720" w:hanging="360"/>
+      </w:pPr>
+      <w:rPr>
+        <w:rFonts w:ascii="Symbol" w:hAnsi="Symbol" w:hint="default"/>
+        <w:sz w:val="20"/>
+      </w:rPr>
+    </w:lvl>
+    <w:lvl w:ilvl="1" w:tentative="1">
+      <w:start w:val="1"/>
+      <w:numFmt w:val="bullet"/>
+      <w:lvlText w:val="o"/>
+      <w:lvlJc w:val="left"/>
+      <w:pPr>
+        <w:tabs>
+          <w:tab w:val="num" w:pos="1440"/>
+        </w:tabs>
+        <w:ind w:left="1440" w:hanging="360"/>
+      </w:pPr>
+      <w:rPr>
+        <w:rFonts w:ascii="Courier New" w:hAnsi="Courier New" w:hint="default"/>
+        <w:sz w:val="20"/>
+      </w:rPr>
+    </w:lvl>
+    <w:lvl w:ilvl="2" w:tentative="1">
+      <w:start w:val="1"/>
+      <w:numFmt w:val="bullet"/>
+      <w:lvlText w:val=""/>
+      <w:lvlJc w:val="left"/>
+      <w:pPr>
+        <w:tabs>
+          <w:tab w:val="num" w:pos="2160"/>
+        </w:tabs>
+        <w:ind w:left="2160" w:hanging="360"/>
+      </w:pPr>
+      <w:rPr>
+        <w:rFonts w:ascii="Wingdings" w:hAnsi="Wingdings" w:hint="default"/>
+        <w:sz w:val="20"/>
+      </w:rPr>
+    </w:lvl>
+    <w:lvl w:ilvl="3" w:tentative="1">
+      <w:start w:val="1"/>
+      <w:numFmt w:val="bullet"/>
+      <w:lvlText w:val=""/>
+      <w:lvlJc w:val="left"/>
+      <w:pPr>
+        <w:tabs>
+          <w:tab w:val="num" w:pos="2880"/>
+        </w:tabs>
+        <w:ind w:left="2880" w:hanging="360"/>
+      </w:pPr>
+      <w:rPr>
+        <w:rFonts w:ascii="Wingdings" w:hAnsi="Wingdings" w:hint="default"/>
+        <w:sz w:val="20"/>
+      </w:rPr>
+    </w:lvl>
+    <w:lvl w:ilvl="4" w:tentative="1">
+      <w:start w:val="1"/>
+      <w:numFmt w:val="bullet"/>
+      <w:lvlText w:val=""/>
+      <w:lvlJc w:val="left"/>
+      <w:pPr>
+        <w:tabs>
+          <w:tab w:val="num" w:pos="3600"/>
+        </w:tabs>
+        <w:ind w:left="3600" w:hanging="360"/>
+      </w:pPr>
+      <w:rPr>
+        <w:rFonts w:ascii="Wingdings" w:hAnsi="Wingdings" w:hint="default"/>
+        <w:sz w:val="20"/>
+      </w:rPr>
+    </w:lvl>
+    <w:lvl w:ilvl="5" w:tentative="1">
+      <w:start w:val="1"/>
+      <w:numFmt w:val="bullet"/>
+      <w:lvlText w:val=""/>
+      <w:lvlJc w:val="left"/>
+      <w:pPr>
+        <w:tabs>
+          <w:tab w:val="num" w:pos="4320"/>
+        </w:tabs>
+        <w:ind w:left="4320" w:hanging="360"/>
+      </w:pPr>
+      <w:rPr>
+        <w:rFonts w:ascii="Wingdings" w:hAnsi="Wingdings" w:hint="default"/>
+        <w:sz w:val="20"/>
+      </w:rPr>
+    </w:lvl>
+    <w:lvl w:ilvl="6" w:tentative="1">
+      <w:start w:val="1"/>
+      <w:numFmt w:val="bullet"/>
+      <w:lvlText w:val=""/>
+      <w:lvlJc w:val="left"/>
+      <w:pPr>
+        <w:tabs>
+          <w:tab w:val="num" w:pos="5040"/>
+        </w:tabs>
+        <w:ind w:left="5040" w:hanging="360"/>
+      </w:pPr>
+      <w:rPr>
+        <w:rFonts w:ascii="Wingdings" w:hAnsi="Wingdings" w:hint="default"/>
+        <w:sz w:val="20"/>
+      </w:rPr>
+    </w:lvl>
+    <w:lvl w:ilvl="7" w:tentative="1">
+      <w:start w:val="1"/>
+      <w:numFmt w:val="bullet"/>
+      <w:lvlText w:val=""/>
+      <w:lvlJc w:val="left"/>
+      <w:pPr>
+        <w:tabs>
+          <w:tab w:val="num" w:pos="5760"/>
+        </w:tabs>
+        <w:ind w:left="5760" w:hanging="360"/>
+      </w:pPr>
+      <w:rPr>
+        <w:rFonts w:ascii="Wingdings" w:hAnsi="Wingdings" w:hint="default"/>
+        <w:sz w:val="20"/>
+      </w:rPr>
+    </w:lvl>
+    <w:lvl w:ilvl="8" w:tentative="1">
+      <w:start w:val="1"/>
+      <w:numFmt w:val="bullet"/>
+      <w:lvlText w:val=""/>
+      <w:lvlJc w:val="left"/>
+      <w:pPr>
+        <w:tabs>
+          <w:tab w:val="num" w:pos="6480"/>
+        </w:tabs>
+        <w:ind w:left="6480" w:hanging="360"/>
+      </w:pPr>
+      <w:rPr>
+        <w:rFonts w:ascii="Wingdings" w:hAnsi="Wingdings" w:hint="default"/>
+        <w:sz w:val="20"/>
+      </w:rPr>
+    </w:lvl>
+  </w:abstractNum>
+  <w:abstractNum w:abstractNumId="7" w15:restartNumberingAfterBreak="0">
+    <w:nsid w:val="2BF3425A"/>
+    <w:multiLevelType w:val="multilevel"/>
+    <w:tmpl w:val="8AB4B488"/>
+    <w:lvl w:ilvl="0">
+      <w:start w:val="1"/>
+      <w:numFmt w:val="bullet"/>
+      <w:lvlText w:val=""/>
+      <w:lvlJc w:val="left"/>
+      <w:pPr>
+        <w:tabs>
+          <w:tab w:val="num" w:pos="720"/>
+        </w:tabs>
+        <w:ind w:left="720" w:hanging="360"/>
+      </w:pPr>
+      <w:rPr>
+        <w:rFonts w:ascii="Symbol" w:hAnsi="Symbol" w:hint="default"/>
+        <w:sz w:val="20"/>
+      </w:rPr>
+    </w:lvl>
+    <w:lvl w:ilvl="1" w:tentative="1">
+      <w:start w:val="1"/>
+      <w:numFmt w:val="bullet"/>
+      <w:lvlText w:val="o"/>
+      <w:lvlJc w:val="left"/>
+      <w:pPr>
+        <w:tabs>
+          <w:tab w:val="num" w:pos="1440"/>
+        </w:tabs>
+        <w:ind w:left="1440" w:hanging="360"/>
+      </w:pPr>
+      <w:rPr>
+        <w:rFonts w:ascii="Courier New" w:hAnsi="Courier New" w:hint="default"/>
+        <w:sz w:val="20"/>
+      </w:rPr>
+    </w:lvl>
+    <w:lvl w:ilvl="2" w:tentative="1">
+      <w:start w:val="1"/>
+      <w:numFmt w:val="bullet"/>
+      <w:lvlText w:val=""/>
+      <w:lvlJc w:val="left"/>
+      <w:pPr>
+        <w:tabs>
+          <w:tab w:val="num" w:pos="2160"/>
+        </w:tabs>
+        <w:ind w:left="2160" w:hanging="360"/>
+      </w:pPr>
+      <w:rPr>
+        <w:rFonts w:ascii="Wingdings" w:hAnsi="Wingdings" w:hint="default"/>
+        <w:sz w:val="20"/>
+      </w:rPr>
+    </w:lvl>
+    <w:lvl w:ilvl="3" w:tentative="1">
+      <w:start w:val="1"/>
+      <w:numFmt w:val="bullet"/>
+      <w:lvlText w:val=""/>
+      <w:lvlJc w:val="left"/>
+      <w:pPr>
+        <w:tabs>
+          <w:tab w:val="num" w:pos="2880"/>
+        </w:tabs>
+        <w:ind w:left="2880" w:hanging="360"/>
+      </w:pPr>
+      <w:rPr>
+        <w:rFonts w:ascii="Wingdings" w:hAnsi="Wingdings" w:hint="default"/>
+        <w:sz w:val="20"/>
+      </w:rPr>
+    </w:lvl>
+    <w:lvl w:ilvl="4" w:tentative="1">
+      <w:start w:val="1"/>
+      <w:numFmt w:val="bullet"/>
+      <w:lvlText w:val=""/>
+      <w:lvlJc w:val="left"/>
+      <w:pPr>
+        <w:tabs>
+          <w:tab w:val="num" w:pos="3600"/>
+        </w:tabs>
+        <w:ind w:left="3600" w:hanging="360"/>
+      </w:pPr>
+      <w:rPr>
+        <w:rFonts w:ascii="Wingdings" w:hAnsi="Wingdings" w:hint="default"/>
+        <w:sz w:val="20"/>
+      </w:rPr>
+    </w:lvl>
+    <w:lvl w:ilvl="5" w:tentative="1">
+      <w:start w:val="1"/>
+      <w:numFmt w:val="bullet"/>
+      <w:lvlText w:val=""/>
+      <w:lvlJc w:val="left"/>
+      <w:pPr>
+        <w:tabs>
+          <w:tab w:val="num" w:pos="4320"/>
+        </w:tabs>
+        <w:ind w:left="4320" w:hanging="360"/>
+      </w:pPr>
+      <w:rPr>
+        <w:rFonts w:ascii="Wingdings" w:hAnsi="Wingdings" w:hint="default"/>
+        <w:sz w:val="20"/>
+      </w:rPr>
+    </w:lvl>
+    <w:lvl w:ilvl="6" w:tentative="1">
+      <w:start w:val="1"/>
+      <w:numFmt w:val="bullet"/>
+      <w:lvlText w:val=""/>
+      <w:lvlJc w:val="left"/>
+      <w:pPr>
+        <w:tabs>
+          <w:tab w:val="num" w:pos="5040"/>
+        </w:tabs>
+        <w:ind w:left="5040" w:hanging="360"/>
+      </w:pPr>
+      <w:rPr>
+        <w:rFonts w:ascii="Wingdings" w:hAnsi="Wingdings" w:hint="default"/>
+        <w:sz w:val="20"/>
+      </w:rPr>
+    </w:lvl>
+    <w:lvl w:ilvl="7" w:tentative="1">
+      <w:start w:val="1"/>
+      <w:numFmt w:val="bullet"/>
+      <w:lvlText w:val=""/>
+      <w:lvlJc w:val="left"/>
+      <w:pPr>
+        <w:tabs>
+          <w:tab w:val="num" w:pos="5760"/>
+        </w:tabs>
+        <w:ind w:left="5760" w:hanging="360"/>
+      </w:pPr>
+      <w:rPr>
+        <w:rFonts w:ascii="Wingdings" w:hAnsi="Wingdings" w:hint="default"/>
+        <w:sz w:val="20"/>
+      </w:rPr>
+    </w:lvl>
+    <w:lvl w:ilvl="8" w:tentative="1">
+      <w:start w:val="1"/>
+      <w:numFmt w:val="bullet"/>
+      <w:lvlText w:val=""/>
+      <w:lvlJc w:val="left"/>
+      <w:pPr>
+        <w:tabs>
+          <w:tab w:val="num" w:pos="6480"/>
+        </w:tabs>
+        <w:ind w:left="6480" w:hanging="360"/>
+      </w:pPr>
+      <w:rPr>
+        <w:rFonts w:ascii="Wingdings" w:hAnsi="Wingdings" w:hint="default"/>
+        <w:sz w:val="20"/>
+      </w:rPr>
+    </w:lvl>
+  </w:abstractNum>
+  <w:abstractNum w:abstractNumId="8" w15:restartNumberingAfterBreak="0">
+    <w:nsid w:val="2C957B7A"/>
+    <w:multiLevelType w:val="multilevel"/>
+    <w:tmpl w:val="8F96E552"/>
+    <w:lvl w:ilvl="0">
+      <w:start w:val="1"/>
+      <w:numFmt w:val="bullet"/>
+      <w:lvlText w:val=""/>
+      <w:lvlJc w:val="left"/>
+      <w:pPr>
+        <w:tabs>
+          <w:tab w:val="num" w:pos="720"/>
+        </w:tabs>
+        <w:ind w:left="720" w:hanging="360"/>
+      </w:pPr>
+      <w:rPr>
+        <w:rFonts w:ascii="Symbol" w:hAnsi="Symbol" w:hint="default"/>
+        <w:sz w:val="20"/>
+      </w:rPr>
+    </w:lvl>
+    <w:lvl w:ilvl="1" w:tentative="1">
+      <w:start w:val="1"/>
+      <w:numFmt w:val="bullet"/>
+      <w:lvlText w:val="o"/>
+      <w:lvlJc w:val="left"/>
+      <w:pPr>
+        <w:tabs>
+          <w:tab w:val="num" w:pos="1440"/>
+        </w:tabs>
+        <w:ind w:left="1440" w:hanging="360"/>
+      </w:pPr>
+      <w:rPr>
+        <w:rFonts w:ascii="Courier New" w:hAnsi="Courier New" w:hint="default"/>
+        <w:sz w:val="20"/>
+      </w:rPr>
+    </w:lvl>
+    <w:lvl w:ilvl="2" w:tentative="1">
+      <w:start w:val="1"/>
+      <w:numFmt w:val="bullet"/>
+      <w:lvlText w:val=""/>
+      <w:lvlJc w:val="left"/>
+      <w:pPr>
+        <w:tabs>
+          <w:tab w:val="num" w:pos="2160"/>
+        </w:tabs>
+        <w:ind w:left="2160" w:hanging="360"/>
+      </w:pPr>
+      <w:rPr>
+        <w:rFonts w:ascii="Wingdings" w:hAnsi="Wingdings" w:hint="default"/>
+        <w:sz w:val="20"/>
+      </w:rPr>
+    </w:lvl>
+    <w:lvl w:ilvl="3" w:tentative="1">
+      <w:start w:val="1"/>
+      <w:numFmt w:val="bullet"/>
+      <w:lvlText w:val=""/>
+      <w:lvlJc w:val="left"/>
+      <w:pPr>
+        <w:tabs>
+          <w:tab w:val="num" w:pos="2880"/>
+        </w:tabs>
+        <w:ind w:left="2880" w:hanging="360"/>
+      </w:pPr>
+      <w:rPr>
+        <w:rFonts w:ascii="Wingdings" w:hAnsi="Wingdings" w:hint="default"/>
+        <w:sz w:val="20"/>
+      </w:rPr>
+    </w:lvl>
+    <w:lvl w:ilvl="4" w:tentative="1">
+      <w:start w:val="1"/>
+      <w:numFmt w:val="bullet"/>
+      <w:lvlText w:val=""/>
+      <w:lvlJc w:val="left"/>
+      <w:pPr>
+        <w:tabs>
+          <w:tab w:val="num" w:pos="3600"/>
+        </w:tabs>
+        <w:ind w:left="3600" w:hanging="360"/>
+      </w:pPr>
+      <w:rPr>
+        <w:rFonts w:ascii="Wingdings" w:hAnsi="Wingdings" w:hint="default"/>
+        <w:sz w:val="20"/>
+      </w:rPr>
+    </w:lvl>
+    <w:lvl w:ilvl="5" w:tentative="1">
+      <w:start w:val="1"/>
+      <w:numFmt w:val="bullet"/>
+      <w:lvlText w:val=""/>
+      <w:lvlJc w:val="left"/>
+      <w:pPr>
+        <w:tabs>
+          <w:tab w:val="num" w:pos="4320"/>
+        </w:tabs>
+        <w:ind w:left="4320" w:hanging="360"/>
+      </w:pPr>
+      <w:rPr>
+        <w:rFonts w:ascii="Wingdings" w:hAnsi="Wingdings" w:hint="default"/>
+        <w:sz w:val="20"/>
+      </w:rPr>
+    </w:lvl>
+    <w:lvl w:ilvl="6" w:tentative="1">
+      <w:start w:val="1"/>
+      <w:numFmt w:val="bullet"/>
+      <w:lvlText w:val=""/>
+      <w:lvlJc w:val="left"/>
+      <w:pPr>
+        <w:tabs>
+          <w:tab w:val="num" w:pos="5040"/>
+        </w:tabs>
+        <w:ind w:left="5040" w:hanging="360"/>
+      </w:pPr>
+      <w:rPr>
+        <w:rFonts w:ascii="Wingdings" w:hAnsi="Wingdings" w:hint="default"/>
+        <w:sz w:val="20"/>
+      </w:rPr>
+    </w:lvl>
+    <w:lvl w:ilvl="7" w:tentative="1">
+      <w:start w:val="1"/>
+      <w:numFmt w:val="bullet"/>
+      <w:lvlText w:val=""/>
+      <w:lvlJc w:val="left"/>
+      <w:pPr>
+        <w:tabs>
+          <w:tab w:val="num" w:pos="5760"/>
+        </w:tabs>
+        <w:ind w:left="5760" w:hanging="360"/>
+      </w:pPr>
+      <w:rPr>
+        <w:rFonts w:ascii="Wingdings" w:hAnsi="Wingdings" w:hint="default"/>
+        <w:sz w:val="20"/>
+      </w:rPr>
+    </w:lvl>
+    <w:lvl w:ilvl="8" w:tentative="1">
+      <w:start w:val="1"/>
+      <w:numFmt w:val="bullet"/>
+      <w:lvlText w:val=""/>
+      <w:lvlJc w:val="left"/>
+      <w:pPr>
+        <w:tabs>
+          <w:tab w:val="num" w:pos="6480"/>
+        </w:tabs>
+        <w:ind w:left="6480" w:hanging="360"/>
+      </w:pPr>
+      <w:rPr>
+        <w:rFonts w:ascii="Wingdings" w:hAnsi="Wingdings" w:hint="default"/>
+        <w:sz w:val="20"/>
+      </w:rPr>
+    </w:lvl>
+  </w:abstractNum>
+  <w:abstractNum w:abstractNumId="9" w15:restartNumberingAfterBreak="0">
+    <w:nsid w:val="33812024"/>
+    <w:multiLevelType w:val="multilevel"/>
+    <w:tmpl w:val="7710FB60"/>
+    <w:lvl w:ilvl="0">
+      <w:start w:val="1"/>
+      <w:numFmt w:val="bullet"/>
+      <w:lvlText w:val=""/>
+      <w:lvlJc w:val="left"/>
+      <w:pPr>
+        <w:tabs>
+          <w:tab w:val="num" w:pos="720"/>
+        </w:tabs>
+        <w:ind w:left="720" w:hanging="360"/>
+      </w:pPr>
+      <w:rPr>
+        <w:rFonts w:ascii="Symbol" w:hAnsi="Symbol" w:hint="default"/>
+        <w:sz w:val="20"/>
+      </w:rPr>
+    </w:lvl>
+    <w:lvl w:ilvl="1">
+      <w:start w:val="1"/>
+      <w:numFmt w:val="bullet"/>
+      <w:lvlText w:val="o"/>
+      <w:lvlJc w:val="left"/>
+      <w:pPr>
+        <w:tabs>
+          <w:tab w:val="num" w:pos="1440"/>
+        </w:tabs>
+        <w:ind w:left="1440" w:hanging="360"/>
+      </w:pPr>
+      <w:rPr>
+        <w:rFonts w:ascii="Courier New" w:hAnsi="Courier New" w:hint="default"/>
+        <w:sz w:val="20"/>
+      </w:rPr>
+    </w:lvl>
+    <w:lvl w:ilvl="2" w:tentative="1">
+      <w:start w:val="1"/>
+      <w:numFmt w:val="bullet"/>
+      <w:lvlText w:val=""/>
+      <w:lvlJc w:val="left"/>
+      <w:pPr>
+        <w:tabs>
+          <w:tab w:val="num" w:pos="2160"/>
+        </w:tabs>
+        <w:ind w:left="2160" w:hanging="360"/>
+      </w:pPr>
+      <w:rPr>
+        <w:rFonts w:ascii="Wingdings" w:hAnsi="Wingdings" w:hint="default"/>
+        <w:sz w:val="20"/>
+      </w:rPr>
+    </w:lvl>
+    <w:lvl w:ilvl="3" w:tentative="1">
+      <w:start w:val="1"/>
+      <w:numFmt w:val="bullet"/>
+      <w:lvlText w:val=""/>
+      <w:lvlJc w:val="left"/>
+      <w:pPr>
+        <w:tabs>
+          <w:tab w:val="num" w:pos="2880"/>
+        </w:tabs>
+        <w:ind w:left="2880" w:hanging="360"/>
+      </w:pPr>
+      <w:rPr>
+        <w:rFonts w:ascii="Wingdings" w:hAnsi="Wingdings" w:hint="default"/>
+        <w:sz w:val="20"/>
+      </w:rPr>
+    </w:lvl>
+    <w:lvl w:ilvl="4" w:tentative="1">
+      <w:start w:val="1"/>
+      <w:numFmt w:val="bullet"/>
+      <w:lvlText w:val=""/>
+      <w:lvlJc w:val="left"/>
+      <w:pPr>
+        <w:tabs>
+          <w:tab w:val="num" w:pos="3600"/>
+        </w:tabs>
+        <w:ind w:left="3600" w:hanging="360"/>
+      </w:pPr>
+      <w:rPr>
+        <w:rFonts w:ascii="Wingdings" w:hAnsi="Wingdings" w:hint="default"/>
+        <w:sz w:val="20"/>
+      </w:rPr>
+    </w:lvl>
+    <w:lvl w:ilvl="5" w:tentative="1">
+      <w:start w:val="1"/>
+      <w:numFmt w:val="bullet"/>
+      <w:lvlText w:val=""/>
+      <w:lvlJc w:val="left"/>
+      <w:pPr>
+        <w:tabs>
+          <w:tab w:val="num" w:pos="4320"/>
+        </w:tabs>
+        <w:ind w:left="4320" w:hanging="360"/>
+      </w:pPr>
+      <w:rPr>
+        <w:rFonts w:ascii="Wingdings" w:hAnsi="Wingdings" w:hint="default"/>
+        <w:sz w:val="20"/>
+      </w:rPr>
+    </w:lvl>
+    <w:lvl w:ilvl="6" w:tentative="1">
+      <w:start w:val="1"/>
+      <w:numFmt w:val="bullet"/>
+      <w:lvlText w:val=""/>
+      <w:lvlJc w:val="left"/>
+      <w:pPr>
+        <w:tabs>
+          <w:tab w:val="num" w:pos="5040"/>
+        </w:tabs>
+        <w:ind w:left="5040" w:hanging="360"/>
+      </w:pPr>
+      <w:rPr>
+        <w:rFonts w:ascii="Wingdings" w:hAnsi="Wingdings" w:hint="default"/>
+        <w:sz w:val="20"/>
+      </w:rPr>
+    </w:lvl>
+    <w:lvl w:ilvl="7" w:tentative="1">
+      <w:start w:val="1"/>
+      <w:numFmt w:val="bullet"/>
+      <w:lvlText w:val=""/>
+      <w:lvlJc w:val="left"/>
+      <w:pPr>
+        <w:tabs>
+          <w:tab w:val="num" w:pos="5760"/>
+        </w:tabs>
+        <w:ind w:left="5760" w:hanging="360"/>
+      </w:pPr>
+      <w:rPr>
+        <w:rFonts w:ascii="Wingdings" w:hAnsi="Wingdings" w:hint="default"/>
+        <w:sz w:val="20"/>
+      </w:rPr>
+    </w:lvl>
+    <w:lvl w:ilvl="8" w:tentative="1">
+      <w:start w:val="1"/>
+      <w:numFmt w:val="bullet"/>
+      <w:lvlText w:val=""/>
+      <w:lvlJc w:val="left"/>
+      <w:pPr>
+        <w:tabs>
+          <w:tab w:val="num" w:pos="6480"/>
+        </w:tabs>
+        <w:ind w:left="6480" w:hanging="360"/>
+      </w:pPr>
+      <w:rPr>
+        <w:rFonts w:ascii="Wingdings" w:hAnsi="Wingdings" w:hint="default"/>
+        <w:sz w:val="20"/>
+      </w:rPr>
+    </w:lvl>
+  </w:abstractNum>
+  <w:abstractNum w:abstractNumId="10" w15:restartNumberingAfterBreak="0">
+    <w:nsid w:val="379757F1"/>
+    <w:multiLevelType w:val="multilevel"/>
+    <w:tmpl w:val="26F277B8"/>
+    <w:lvl w:ilvl="0">
+      <w:start w:val="1"/>
+      <w:numFmt w:val="bullet"/>
+      <w:lvlText w:val=""/>
+      <w:lvlJc w:val="left"/>
+      <w:pPr>
+        <w:tabs>
+          <w:tab w:val="num" w:pos="720"/>
+        </w:tabs>
+        <w:ind w:left="720" w:hanging="360"/>
+      </w:pPr>
+      <w:rPr>
+        <w:rFonts w:ascii="Symbol" w:hAnsi="Symbol" w:hint="default"/>
+        <w:sz w:val="20"/>
+      </w:rPr>
+    </w:lvl>
+    <w:lvl w:ilvl="1" w:tentative="1">
+      <w:start w:val="1"/>
+      <w:numFmt w:val="bullet"/>
+      <w:lvlText w:val="o"/>
+      <w:lvlJc w:val="left"/>
+      <w:pPr>
+        <w:tabs>
+          <w:tab w:val="num" w:pos="1440"/>
+        </w:tabs>
+        <w:ind w:left="1440" w:hanging="360"/>
+      </w:pPr>
+      <w:rPr>
+        <w:rFonts w:ascii="Courier New" w:hAnsi="Courier New" w:hint="default"/>
+        <w:sz w:val="20"/>
+      </w:rPr>
+    </w:lvl>
+    <w:lvl w:ilvl="2" w:tentative="1">
+      <w:start w:val="1"/>
+      <w:numFmt w:val="bullet"/>
+      <w:lvlText w:val=""/>
+      <w:lvlJc w:val="left"/>
+      <w:pPr>
+        <w:tabs>
+          <w:tab w:val="num" w:pos="2160"/>
+        </w:tabs>
+        <w:ind w:left="2160" w:hanging="360"/>
+      </w:pPr>
+      <w:rPr>
+        <w:rFonts w:ascii="Wingdings" w:hAnsi="Wingdings" w:hint="default"/>
+        <w:sz w:val="20"/>
+      </w:rPr>
+    </w:lvl>
+    <w:lvl w:ilvl="3" w:tentative="1">
+      <w:start w:val="1"/>
+      <w:numFmt w:val="bullet"/>
+      <w:lvlText w:val=""/>
+      <w:lvlJc w:val="left"/>
+      <w:pPr>
+        <w:tabs>
+          <w:tab w:val="num" w:pos="2880"/>
+        </w:tabs>
+        <w:ind w:left="2880" w:hanging="360"/>
+      </w:pPr>
+      <w:rPr>
+        <w:rFonts w:ascii="Wingdings" w:hAnsi="Wingdings" w:hint="default"/>
+        <w:sz w:val="20"/>
+      </w:rPr>
+    </w:lvl>
+    <w:lvl w:ilvl="4" w:tentative="1">
+      <w:start w:val="1"/>
+      <w:numFmt w:val="bullet"/>
+      <w:lvlText w:val=""/>
+      <w:lvlJc w:val="left"/>
+      <w:pPr>
+        <w:tabs>
+          <w:tab w:val="num" w:pos="3600"/>
+        </w:tabs>
+        <w:ind w:left="3600" w:hanging="360"/>
+      </w:pPr>
+      <w:rPr>
+        <w:rFonts w:ascii="Wingdings" w:hAnsi="Wingdings" w:hint="default"/>
+        <w:sz w:val="20"/>
+      </w:rPr>
+    </w:lvl>
+    <w:lvl w:ilvl="5" w:tentative="1">
+      <w:start w:val="1"/>
+      <w:numFmt w:val="bullet"/>
+      <w:lvlText w:val=""/>
+      <w:lvlJc w:val="left"/>
+      <w:pPr>
+        <w:tabs>
+          <w:tab w:val="num" w:pos="4320"/>
+        </w:tabs>
+        <w:ind w:left="4320" w:hanging="360"/>
+      </w:pPr>
+      <w:rPr>
+        <w:rFonts w:ascii="Wingdings" w:hAnsi="Wingdings" w:hint="default"/>
+        <w:sz w:val="20"/>
+      </w:rPr>
+    </w:lvl>
+    <w:lvl w:ilvl="6" w:tentative="1">
+      <w:start w:val="1"/>
+      <w:numFmt w:val="bullet"/>
+      <w:lvlText w:val=""/>
+      <w:lvlJc w:val="left"/>
+      <w:pPr>
+        <w:tabs>
+          <w:tab w:val="num" w:pos="5040"/>
+        </w:tabs>
+        <w:ind w:left="5040" w:hanging="360"/>
+      </w:pPr>
+      <w:rPr>
+        <w:rFonts w:ascii="Wingdings" w:hAnsi="Wingdings" w:hint="default"/>
+        <w:sz w:val="20"/>
+      </w:rPr>
+    </w:lvl>
+    <w:lvl w:ilvl="7" w:tentative="1">
+      <w:start w:val="1"/>
+      <w:numFmt w:val="bullet"/>
+      <w:lvlText w:val=""/>
+      <w:lvlJc w:val="left"/>
+      <w:pPr>
+        <w:tabs>
+          <w:tab w:val="num" w:pos="5760"/>
+        </w:tabs>
+        <w:ind w:left="5760" w:hanging="360"/>
+      </w:pPr>
+      <w:rPr>
+        <w:rFonts w:ascii="Wingdings" w:hAnsi="Wingdings" w:hint="default"/>
+        <w:sz w:val="20"/>
+      </w:rPr>
+    </w:lvl>
+    <w:lvl w:ilvl="8" w:tentative="1">
+      <w:start w:val="1"/>
+      <w:numFmt w:val="bullet"/>
+      <w:lvlText w:val=""/>
+      <w:lvlJc w:val="left"/>
+      <w:pPr>
+        <w:tabs>
+          <w:tab w:val="num" w:pos="6480"/>
+        </w:tabs>
+        <w:ind w:left="6480" w:hanging="360"/>
+      </w:pPr>
+      <w:rPr>
+        <w:rFonts w:ascii="Wingdings" w:hAnsi="Wingdings" w:hint="default"/>
+        <w:sz w:val="20"/>
+      </w:rPr>
+    </w:lvl>
+  </w:abstractNum>
+  <w:abstractNum w:abstractNumId="11" w15:restartNumberingAfterBreak="0">
+    <w:nsid w:val="38584BC5"/>
+    <w:multiLevelType w:val="multilevel"/>
+    <w:tmpl w:val="1412491E"/>
+    <w:lvl w:ilvl="0">
+      <w:start w:val="1"/>
+      <w:numFmt w:val="bullet"/>
+      <w:lvlText w:val=""/>
+      <w:lvlJc w:val="left"/>
+      <w:pPr>
+        <w:tabs>
+          <w:tab w:val="num" w:pos="720"/>
+        </w:tabs>
+        <w:ind w:left="720" w:hanging="360"/>
+      </w:pPr>
+      <w:rPr>
+        <w:rFonts w:ascii="Symbol" w:hAnsi="Symbol" w:hint="default"/>
+        <w:sz w:val="20"/>
+      </w:rPr>
+    </w:lvl>
+    <w:lvl w:ilvl="1">
+      <w:start w:val="1"/>
+      <w:numFmt w:val="bullet"/>
+      <w:lvlText w:val="o"/>
+      <w:lvlJc w:val="left"/>
+      <w:pPr>
+        <w:tabs>
+          <w:tab w:val="num" w:pos="1440"/>
+        </w:tabs>
+        <w:ind w:left="1440" w:hanging="360"/>
+      </w:pPr>
+      <w:rPr>
+        <w:rFonts w:ascii="Courier New" w:hAnsi="Courier New" w:hint="default"/>
+        <w:sz w:val="20"/>
+      </w:rPr>
+    </w:lvl>
+    <w:lvl w:ilvl="2" w:tentative="1">
+      <w:start w:val="1"/>
+      <w:numFmt w:val="bullet"/>
+      <w:lvlText w:val=""/>
+      <w:lvlJc w:val="left"/>
+      <w:pPr>
+        <w:tabs>
+          <w:tab w:val="num" w:pos="2160"/>
+        </w:tabs>
+        <w:ind w:left="2160" w:hanging="360"/>
+      </w:pPr>
+      <w:rPr>
+        <w:rFonts w:ascii="Wingdings" w:hAnsi="Wingdings" w:hint="default"/>
+        <w:sz w:val="20"/>
+      </w:rPr>
+    </w:lvl>
+    <w:lvl w:ilvl="3" w:tentative="1">
+      <w:start w:val="1"/>
+      <w:numFmt w:val="bullet"/>
+      <w:lvlText w:val=""/>
+      <w:lvlJc w:val="left"/>
+      <w:pPr>
+        <w:tabs>
+          <w:tab w:val="num" w:pos="2880"/>
+        </w:tabs>
+        <w:ind w:left="2880" w:hanging="360"/>
+      </w:pPr>
+      <w:rPr>
+        <w:rFonts w:ascii="Wingdings" w:hAnsi="Wingdings" w:hint="default"/>
+        <w:sz w:val="20"/>
+      </w:rPr>
+    </w:lvl>
+    <w:lvl w:ilvl="4" w:tentative="1">
+      <w:start w:val="1"/>
+      <w:numFmt w:val="bullet"/>
+      <w:lvlText w:val=""/>
+      <w:lvlJc w:val="left"/>
+      <w:pPr>
+        <w:tabs>
+          <w:tab w:val="num" w:pos="3600"/>
+        </w:tabs>
+        <w:ind w:left="3600" w:hanging="360"/>
+      </w:pPr>
+      <w:rPr>
+        <w:rFonts w:ascii="Wingdings" w:hAnsi="Wingdings" w:hint="default"/>
+        <w:sz w:val="20"/>
+      </w:rPr>
+    </w:lvl>
+    <w:lvl w:ilvl="5" w:tentative="1">
+      <w:start w:val="1"/>
+      <w:numFmt w:val="bullet"/>
+      <w:lvlText w:val=""/>
+      <w:lvlJc w:val="left"/>
+      <w:pPr>
+        <w:tabs>
+          <w:tab w:val="num" w:pos="4320"/>
+        </w:tabs>
+        <w:ind w:left="4320" w:hanging="360"/>
+      </w:pPr>
+      <w:rPr>
+        <w:rFonts w:ascii="Wingdings" w:hAnsi="Wingdings" w:hint="default"/>
+        <w:sz w:val="20"/>
+      </w:rPr>
+    </w:lvl>
+    <w:lvl w:ilvl="6" w:tentative="1">
+      <w:start w:val="1"/>
+      <w:numFmt w:val="bullet"/>
+      <w:lvlText w:val=""/>
+      <w:lvlJc w:val="left"/>
+      <w:pPr>
+        <w:tabs>
+          <w:tab w:val="num" w:pos="5040"/>
+        </w:tabs>
+        <w:ind w:left="5040" w:hanging="360"/>
+      </w:pPr>
+      <w:rPr>
+        <w:rFonts w:ascii="Wingdings" w:hAnsi="Wingdings" w:hint="default"/>
+        <w:sz w:val="20"/>
+      </w:rPr>
+    </w:lvl>
+    <w:lvl w:ilvl="7" w:tentative="1">
+      <w:start w:val="1"/>
+      <w:numFmt w:val="bullet"/>
+      <w:lvlText w:val=""/>
+      <w:lvlJc w:val="left"/>
+      <w:pPr>
+        <w:tabs>
+          <w:tab w:val="num" w:pos="5760"/>
+        </w:tabs>
+        <w:ind w:left="5760" w:hanging="360"/>
+      </w:pPr>
+      <w:rPr>
+        <w:rFonts w:ascii="Wingdings" w:hAnsi="Wingdings" w:hint="default"/>
+        <w:sz w:val="20"/>
+      </w:rPr>
+    </w:lvl>
+    <w:lvl w:ilvl="8" w:tentative="1">
+      <w:start w:val="1"/>
+      <w:numFmt w:val="bullet"/>
+      <w:lvlText w:val=""/>
+      <w:lvlJc w:val="left"/>
+      <w:pPr>
+        <w:tabs>
+          <w:tab w:val="num" w:pos="6480"/>
+        </w:tabs>
+        <w:ind w:left="6480" w:hanging="360"/>
+      </w:pPr>
+      <w:rPr>
+        <w:rFonts w:ascii="Wingdings" w:hAnsi="Wingdings" w:hint="default"/>
+        <w:sz w:val="20"/>
+      </w:rPr>
+    </w:lvl>
+  </w:abstractNum>
+  <w:abstractNum w:abstractNumId="12" w15:restartNumberingAfterBreak="0">
+    <w:nsid w:val="42377201"/>
+    <w:multiLevelType w:val="multilevel"/>
+    <w:tmpl w:val="B6B85CFE"/>
+    <w:lvl w:ilvl="0">
+      <w:start w:val="1"/>
+      <w:numFmt w:val="bullet"/>
+      <w:lvlText w:val=""/>
+      <w:lvlJc w:val="left"/>
+      <w:pPr>
+        <w:tabs>
+          <w:tab w:val="num" w:pos="720"/>
+        </w:tabs>
+        <w:ind w:left="720" w:hanging="360"/>
+      </w:pPr>
+      <w:rPr>
+        <w:rFonts w:ascii="Symbol" w:hAnsi="Symbol" w:hint="default"/>
+        <w:sz w:val="20"/>
+      </w:rPr>
+    </w:lvl>
+    <w:lvl w:ilvl="1" w:tentative="1">
+      <w:start w:val="1"/>
+      <w:numFmt w:val="bullet"/>
+      <w:lvlText w:val="o"/>
+      <w:lvlJc w:val="left"/>
+      <w:pPr>
+        <w:tabs>
+          <w:tab w:val="num" w:pos="1440"/>
+        </w:tabs>
+        <w:ind w:left="1440" w:hanging="360"/>
+      </w:pPr>
+      <w:rPr>
+        <w:rFonts w:ascii="Courier New" w:hAnsi="Courier New" w:hint="default"/>
+        <w:sz w:val="20"/>
+      </w:rPr>
+    </w:lvl>
+    <w:lvl w:ilvl="2" w:tentative="1">
+      <w:start w:val="1"/>
+      <w:numFmt w:val="bullet"/>
+      <w:lvlText w:val=""/>
+      <w:lvlJc w:val="left"/>
+      <w:pPr>
+        <w:tabs>
+          <w:tab w:val="num" w:pos="2160"/>
+        </w:tabs>
+        <w:ind w:left="2160" w:hanging="360"/>
+      </w:pPr>
+      <w:rPr>
+        <w:rFonts w:ascii="Wingdings" w:hAnsi="Wingdings" w:hint="default"/>
+        <w:sz w:val="20"/>
+      </w:rPr>
+    </w:lvl>
+    <w:lvl w:ilvl="3" w:tentative="1">
+      <w:start w:val="1"/>
+      <w:numFmt w:val="bullet"/>
+      <w:lvlText w:val=""/>
+      <w:lvlJc w:val="left"/>
+      <w:pPr>
+        <w:tabs>
+          <w:tab w:val="num" w:pos="2880"/>
+        </w:tabs>
+        <w:ind w:left="2880" w:hanging="360"/>
+      </w:pPr>
+      <w:rPr>
+        <w:rFonts w:ascii="Wingdings" w:hAnsi="Wingdings" w:hint="default"/>
+        <w:sz w:val="20"/>
+      </w:rPr>
+    </w:lvl>
+    <w:lvl w:ilvl="4" w:tentative="1">
+      <w:start w:val="1"/>
+      <w:numFmt w:val="bullet"/>
+      <w:lvlText w:val=""/>
+      <w:lvlJc w:val="left"/>
+      <w:pPr>
+        <w:tabs>
+          <w:tab w:val="num" w:pos="3600"/>
+        </w:tabs>
+        <w:ind w:left="3600" w:hanging="360"/>
+      </w:pPr>
+      <w:rPr>
+        <w:rFonts w:ascii="Wingdings" w:hAnsi="Wingdings" w:hint="default"/>
+        <w:sz w:val="20"/>
+      </w:rPr>
+    </w:lvl>
+    <w:lvl w:ilvl="5" w:tentative="1">
+      <w:start w:val="1"/>
+      <w:numFmt w:val="bullet"/>
+      <w:lvlText w:val=""/>
+      <w:lvlJc w:val="left"/>
+      <w:pPr>
+        <w:tabs>
+          <w:tab w:val="num" w:pos="4320"/>
+        </w:tabs>
+        <w:ind w:left="4320" w:hanging="360"/>
+      </w:pPr>
+      <w:rPr>
+        <w:rFonts w:ascii="Wingdings" w:hAnsi="Wingdings" w:hint="default"/>
+        <w:sz w:val="20"/>
+      </w:rPr>
+    </w:lvl>
+    <w:lvl w:ilvl="6" w:tentative="1">
+      <w:start w:val="1"/>
+      <w:numFmt w:val="bullet"/>
+      <w:lvlText w:val=""/>
+      <w:lvlJc w:val="left"/>
+      <w:pPr>
+        <w:tabs>
+          <w:tab w:val="num" w:pos="5040"/>
+        </w:tabs>
+        <w:ind w:left="5040" w:hanging="360"/>
+      </w:pPr>
+      <w:rPr>
+        <w:rFonts w:ascii="Wingdings" w:hAnsi="Wingdings" w:hint="default"/>
+        <w:sz w:val="20"/>
+      </w:rPr>
+    </w:lvl>
+    <w:lvl w:ilvl="7" w:tentative="1">
+      <w:start w:val="1"/>
+      <w:numFmt w:val="bullet"/>
+      <w:lvlText w:val=""/>
+      <w:lvlJc w:val="left"/>
+      <w:pPr>
+        <w:tabs>
+          <w:tab w:val="num" w:pos="5760"/>
+        </w:tabs>
+        <w:ind w:left="5760" w:hanging="360"/>
+      </w:pPr>
+      <w:rPr>
+        <w:rFonts w:ascii="Wingdings" w:hAnsi="Wingdings" w:hint="default"/>
+        <w:sz w:val="20"/>
+      </w:rPr>
+    </w:lvl>
+    <w:lvl w:ilvl="8" w:tentative="1">
+      <w:start w:val="1"/>
+      <w:numFmt w:val="bullet"/>
+      <w:lvlText w:val=""/>
+      <w:lvlJc w:val="left"/>
+      <w:pPr>
+        <w:tabs>
+          <w:tab w:val="num" w:pos="6480"/>
+        </w:tabs>
+        <w:ind w:left="6480" w:hanging="360"/>
+      </w:pPr>
+      <w:rPr>
+        <w:rFonts w:ascii="Wingdings" w:hAnsi="Wingdings" w:hint="default"/>
+        <w:sz w:val="20"/>
+      </w:rPr>
+    </w:lvl>
+  </w:abstractNum>
+  <w:abstractNum w:abstractNumId="13" w15:restartNumberingAfterBreak="0">
+    <w:nsid w:val="554D3B21"/>
+    <w:multiLevelType w:val="multilevel"/>
+    <w:tmpl w:val="5C58F4AA"/>
+    <w:lvl w:ilvl="0">
+      <w:start w:val="1"/>
+      <w:numFmt w:val="bullet"/>
+      <w:lvlText w:val=""/>
+      <w:lvlJc w:val="left"/>
+      <w:pPr>
+        <w:tabs>
+          <w:tab w:val="num" w:pos="720"/>
+        </w:tabs>
+        <w:ind w:left="720" w:hanging="360"/>
+      </w:pPr>
+      <w:rPr>
+        <w:rFonts w:ascii="Symbol" w:hAnsi="Symbol" w:hint="default"/>
+        <w:sz w:val="20"/>
+      </w:rPr>
+    </w:lvl>
+    <w:lvl w:ilvl="1" w:tentative="1">
+      <w:start w:val="1"/>
+      <w:numFmt w:val="bullet"/>
+      <w:lvlText w:val="o"/>
+      <w:lvlJc w:val="left"/>
+      <w:pPr>
+        <w:tabs>
+          <w:tab w:val="num" w:pos="1440"/>
+        </w:tabs>
+        <w:ind w:left="1440" w:hanging="360"/>
+      </w:pPr>
+      <w:rPr>
+        <w:rFonts w:ascii="Courier New" w:hAnsi="Courier New" w:hint="default"/>
+        <w:sz w:val="20"/>
+      </w:rPr>
+    </w:lvl>
+    <w:lvl w:ilvl="2" w:tentative="1">
+      <w:start w:val="1"/>
+      <w:numFmt w:val="bullet"/>
+      <w:lvlText w:val=""/>
+      <w:lvlJc w:val="left"/>
+      <w:pPr>
+        <w:tabs>
+          <w:tab w:val="num" w:pos="2160"/>
+        </w:tabs>
+        <w:ind w:left="2160" w:hanging="360"/>
+      </w:pPr>
+      <w:rPr>
+        <w:rFonts w:ascii="Wingdings" w:hAnsi="Wingdings" w:hint="default"/>
+        <w:sz w:val="20"/>
+      </w:rPr>
+    </w:lvl>
+    <w:lvl w:ilvl="3" w:tentative="1">
+      <w:start w:val="1"/>
+      <w:numFmt w:val="bullet"/>
+      <w:lvlText w:val=""/>
+      <w:lvlJc w:val="left"/>
+      <w:pPr>
+        <w:tabs>
+          <w:tab w:val="num" w:pos="2880"/>
+        </w:tabs>
+        <w:ind w:left="2880" w:hanging="360"/>
+      </w:pPr>
+      <w:rPr>
+        <w:rFonts w:ascii="Wingdings" w:hAnsi="Wingdings" w:hint="default"/>
+        <w:sz w:val="20"/>
+      </w:rPr>
+    </w:lvl>
+    <w:lvl w:ilvl="4" w:tentative="1">
+      <w:start w:val="1"/>
+      <w:numFmt w:val="bullet"/>
+      <w:lvlText w:val=""/>
+      <w:lvlJc w:val="left"/>
+      <w:pPr>
+        <w:tabs>
+          <w:tab w:val="num" w:pos="3600"/>
+        </w:tabs>
+        <w:ind w:left="3600" w:hanging="360"/>
+      </w:pPr>
+      <w:rPr>
+        <w:rFonts w:ascii="Wingdings" w:hAnsi="Wingdings" w:hint="default"/>
+        <w:sz w:val="20"/>
+      </w:rPr>
+    </w:lvl>
+    <w:lvl w:ilvl="5" w:tentative="1">
+      <w:start w:val="1"/>
+      <w:numFmt w:val="bullet"/>
+      <w:lvlText w:val=""/>
+      <w:lvlJc w:val="left"/>
+      <w:pPr>
+        <w:tabs>
+          <w:tab w:val="num" w:pos="4320"/>
+        </w:tabs>
+        <w:ind w:left="4320" w:hanging="360"/>
+      </w:pPr>
+      <w:rPr>
+        <w:rFonts w:ascii="Wingdings" w:hAnsi="Wingdings" w:hint="default"/>
+        <w:sz w:val="20"/>
+      </w:rPr>
+    </w:lvl>
+    <w:lvl w:ilvl="6" w:tentative="1">
+      <w:start w:val="1"/>
+      <w:numFmt w:val="bullet"/>
+      <w:lvlText w:val=""/>
+      <w:lvlJc w:val="left"/>
+      <w:pPr>
+        <w:tabs>
+          <w:tab w:val="num" w:pos="5040"/>
+        </w:tabs>
+        <w:ind w:left="5040" w:hanging="360"/>
+      </w:pPr>
+      <w:rPr>
+        <w:rFonts w:ascii="Wingdings" w:hAnsi="Wingdings" w:hint="default"/>
+        <w:sz w:val="20"/>
+      </w:rPr>
+    </w:lvl>
+    <w:lvl w:ilvl="7" w:tentative="1">
+      <w:start w:val="1"/>
+      <w:numFmt w:val="bullet"/>
+      <w:lvlText w:val=""/>
+      <w:lvlJc w:val="left"/>
+      <w:pPr>
+        <w:tabs>
+          <w:tab w:val="num" w:pos="5760"/>
+        </w:tabs>
+        <w:ind w:left="5760" w:hanging="360"/>
+      </w:pPr>
+      <w:rPr>
+        <w:rFonts w:ascii="Wingdings" w:hAnsi="Wingdings" w:hint="default"/>
+        <w:sz w:val="20"/>
+      </w:rPr>
+    </w:lvl>
+    <w:lvl w:ilvl="8" w:tentative="1">
+      <w:start w:val="1"/>
+      <w:numFmt w:val="bullet"/>
+      <w:lvlText w:val=""/>
+      <w:lvlJc w:val="left"/>
+      <w:pPr>
+        <w:tabs>
+          <w:tab w:val="num" w:pos="6480"/>
+        </w:tabs>
+        <w:ind w:left="6480" w:hanging="360"/>
+      </w:pPr>
+      <w:rPr>
+        <w:rFonts w:ascii="Wingdings" w:hAnsi="Wingdings" w:hint="default"/>
+        <w:sz w:val="20"/>
+      </w:rPr>
+    </w:lvl>
+  </w:abstractNum>
+  <w:abstractNum w:abstractNumId="14" w15:restartNumberingAfterBreak="0">
+    <w:nsid w:val="57714D75"/>
+    <w:multiLevelType w:val="multilevel"/>
+    <w:tmpl w:val="796EECBC"/>
+    <w:lvl w:ilvl="0">
+      <w:start w:val="1"/>
+      <w:numFmt w:val="bullet"/>
+      <w:lvlText w:val=""/>
+      <w:lvlJc w:val="left"/>
+      <w:pPr>
+        <w:tabs>
+          <w:tab w:val="num" w:pos="720"/>
+        </w:tabs>
+        <w:ind w:left="720" w:hanging="360"/>
+      </w:pPr>
+      <w:rPr>
+        <w:rFonts w:ascii="Symbol" w:hAnsi="Symbol" w:hint="default"/>
+        <w:sz w:val="20"/>
+      </w:rPr>
+    </w:lvl>
+    <w:lvl w:ilvl="1" w:tentative="1">
+      <w:start w:val="1"/>
+      <w:numFmt w:val="bullet"/>
+      <w:lvlText w:val="o"/>
+      <w:lvlJc w:val="left"/>
+      <w:pPr>
+        <w:tabs>
+          <w:tab w:val="num" w:pos="1440"/>
+        </w:tabs>
+        <w:ind w:left="1440" w:hanging="360"/>
+      </w:pPr>
+      <w:rPr>
+        <w:rFonts w:ascii="Courier New" w:hAnsi="Courier New" w:hint="default"/>
+        <w:sz w:val="20"/>
+      </w:rPr>
+    </w:lvl>
+    <w:lvl w:ilvl="2" w:tentative="1">
+      <w:start w:val="1"/>
+      <w:numFmt w:val="bullet"/>
+      <w:lvlText w:val=""/>
+      <w:lvlJc w:val="left"/>
+      <w:pPr>
+        <w:tabs>
+          <w:tab w:val="num" w:pos="2160"/>
+        </w:tabs>
+        <w:ind w:left="2160" w:hanging="360"/>
+      </w:pPr>
+      <w:rPr>
+        <w:rFonts w:ascii="Wingdings" w:hAnsi="Wingdings" w:hint="default"/>
+        <w:sz w:val="20"/>
+      </w:rPr>
+    </w:lvl>
+    <w:lvl w:ilvl="3" w:tentative="1">
+      <w:start w:val="1"/>
+      <w:numFmt w:val="bullet"/>
+      <w:lvlText w:val=""/>
+      <w:lvlJc w:val="left"/>
+      <w:pPr>
+        <w:tabs>
+          <w:tab w:val="num" w:pos="2880"/>
+        </w:tabs>
+        <w:ind w:left="2880" w:hanging="360"/>
+      </w:pPr>
+      <w:rPr>
+        <w:rFonts w:ascii="Wingdings" w:hAnsi="Wingdings" w:hint="default"/>
+        <w:sz w:val="20"/>
+      </w:rPr>
+    </w:lvl>
+    <w:lvl w:ilvl="4" w:tentative="1">
+      <w:start w:val="1"/>
+      <w:numFmt w:val="bullet"/>
+      <w:lvlText w:val=""/>
+      <w:lvlJc w:val="left"/>
+      <w:pPr>
+        <w:tabs>
+          <w:tab w:val="num" w:pos="3600"/>
+        </w:tabs>
+        <w:ind w:left="3600" w:hanging="360"/>
+      </w:pPr>
+      <w:rPr>
+        <w:rFonts w:ascii="Wingdings" w:hAnsi="Wingdings" w:hint="default"/>
+        <w:sz w:val="20"/>
+      </w:rPr>
+    </w:lvl>
+    <w:lvl w:ilvl="5" w:tentative="1">
+      <w:start w:val="1"/>
+      <w:numFmt w:val="bullet"/>
+      <w:lvlText w:val=""/>
+      <w:lvlJc w:val="left"/>
+      <w:pPr>
+        <w:tabs>
+          <w:tab w:val="num" w:pos="4320"/>
+        </w:tabs>
+        <w:ind w:left="4320" w:hanging="360"/>
+      </w:pPr>
+      <w:rPr>
+        <w:rFonts w:ascii="Wingdings" w:hAnsi="Wingdings" w:hint="default"/>
+        <w:sz w:val="20"/>
+      </w:rPr>
+    </w:lvl>
+    <w:lvl w:ilvl="6" w:tentative="1">
+      <w:start w:val="1"/>
+      <w:numFmt w:val="bullet"/>
+      <w:lvlText w:val=""/>
+      <w:lvlJc w:val="left"/>
+      <w:pPr>
+        <w:tabs>
+          <w:tab w:val="num" w:pos="5040"/>
+        </w:tabs>
+        <w:ind w:left="5040" w:hanging="360"/>
+      </w:pPr>
+      <w:rPr>
+        <w:rFonts w:ascii="Wingdings" w:hAnsi="Wingdings" w:hint="default"/>
+        <w:sz w:val="20"/>
+      </w:rPr>
+    </w:lvl>
+    <w:lvl w:ilvl="7" w:tentative="1">
+      <w:start w:val="1"/>
+      <w:numFmt w:val="bullet"/>
+      <w:lvlText w:val=""/>
+      <w:lvlJc w:val="left"/>
+      <w:pPr>
+        <w:tabs>
+          <w:tab w:val="num" w:pos="5760"/>
+        </w:tabs>
+        <w:ind w:left="5760" w:hanging="360"/>
+      </w:pPr>
+      <w:rPr>
+        <w:rFonts w:ascii="Wingdings" w:hAnsi="Wingdings" w:hint="default"/>
+        <w:sz w:val="20"/>
+      </w:rPr>
+    </w:lvl>
+    <w:lvl w:ilvl="8" w:tentative="1">
+      <w:start w:val="1"/>
+      <w:numFmt w:val="bullet"/>
+      <w:lvlText w:val=""/>
+      <w:lvlJc w:val="left"/>
+      <w:pPr>
+        <w:tabs>
+          <w:tab w:val="num" w:pos="6480"/>
+        </w:tabs>
+        <w:ind w:left="6480" w:hanging="360"/>
+      </w:pPr>
+      <w:rPr>
+        <w:rFonts w:ascii="Wingdings" w:hAnsi="Wingdings" w:hint="default"/>
+        <w:sz w:val="20"/>
+      </w:rPr>
+    </w:lvl>
+  </w:abstractNum>
+  <w:abstractNum w:abstractNumId="15" w15:restartNumberingAfterBreak="0">
+    <w:nsid w:val="57F774C0"/>
+    <w:multiLevelType w:val="multilevel"/>
+    <w:tmpl w:val="70945A86"/>
+    <w:lvl w:ilvl="0">
+      <w:start w:val="1"/>
+      <w:numFmt w:val="bullet"/>
+      <w:lvlText w:val=""/>
+      <w:lvlJc w:val="left"/>
+      <w:pPr>
+        <w:tabs>
+          <w:tab w:val="num" w:pos="720"/>
+        </w:tabs>
+        <w:ind w:left="720" w:hanging="360"/>
+      </w:pPr>
+      <w:rPr>
+        <w:rFonts w:ascii="Symbol" w:hAnsi="Symbol" w:hint="default"/>
+        <w:sz w:val="20"/>
+      </w:rPr>
+    </w:lvl>
+    <w:lvl w:ilvl="1" w:tentative="1">
+      <w:start w:val="1"/>
+      <w:numFmt w:val="bullet"/>
+      <w:lvlText w:val="o"/>
+      <w:lvlJc w:val="left"/>
+      <w:pPr>
+        <w:tabs>
+          <w:tab w:val="num" w:pos="1440"/>
+        </w:tabs>
+        <w:ind w:left="1440" w:hanging="360"/>
+      </w:pPr>
+      <w:rPr>
+        <w:rFonts w:ascii="Courier New" w:hAnsi="Courier New" w:hint="default"/>
+        <w:sz w:val="20"/>
+      </w:rPr>
+    </w:lvl>
+    <w:lvl w:ilvl="2" w:tentative="1">
+      <w:start w:val="1"/>
+      <w:numFmt w:val="bullet"/>
+      <w:lvlText w:val=""/>
+      <w:lvlJc w:val="left"/>
+      <w:pPr>
+        <w:tabs>
+          <w:tab w:val="num" w:pos="2160"/>
+        </w:tabs>
+        <w:ind w:left="2160" w:hanging="360"/>
+      </w:pPr>
+      <w:rPr>
+        <w:rFonts w:ascii="Wingdings" w:hAnsi="Wingdings" w:hint="default"/>
+        <w:sz w:val="20"/>
+      </w:rPr>
+    </w:lvl>
+    <w:lvl w:ilvl="3" w:tentative="1">
+      <w:start w:val="1"/>
+      <w:numFmt w:val="bullet"/>
+      <w:lvlText w:val=""/>
+      <w:lvlJc w:val="left"/>
+      <w:pPr>
+        <w:tabs>
+          <w:tab w:val="num" w:pos="2880"/>
+        </w:tabs>
+        <w:ind w:left="2880" w:hanging="360"/>
+      </w:pPr>
+      <w:rPr>
+        <w:rFonts w:ascii="Wingdings" w:hAnsi="Wingdings" w:hint="default"/>
+        <w:sz w:val="20"/>
+      </w:rPr>
+    </w:lvl>
+    <w:lvl w:ilvl="4" w:tentative="1">
+      <w:start w:val="1"/>
+      <w:numFmt w:val="bullet"/>
+      <w:lvlText w:val=""/>
+      <w:lvlJc w:val="left"/>
+      <w:pPr>
+        <w:tabs>
+          <w:tab w:val="num" w:pos="3600"/>
+        </w:tabs>
+        <w:ind w:left="3600" w:hanging="360"/>
+      </w:pPr>
+      <w:rPr>
+        <w:rFonts w:ascii="Wingdings" w:hAnsi="Wingdings" w:hint="default"/>
+        <w:sz w:val="20"/>
+      </w:rPr>
+    </w:lvl>
+    <w:lvl w:ilvl="5" w:tentative="1">
+      <w:start w:val="1"/>
+      <w:numFmt w:val="bullet"/>
+      <w:lvlText w:val=""/>
+      <w:lvlJc w:val="left"/>
+      <w:pPr>
+        <w:tabs>
+          <w:tab w:val="num" w:pos="4320"/>
+        </w:tabs>
+        <w:ind w:left="4320" w:hanging="360"/>
+      </w:pPr>
+      <w:rPr>
+        <w:rFonts w:ascii="Wingdings" w:hAnsi="Wingdings" w:hint="default"/>
+        <w:sz w:val="20"/>
+      </w:rPr>
+    </w:lvl>
+    <w:lvl w:ilvl="6" w:tentative="1">
+      <w:start w:val="1"/>
+      <w:numFmt w:val="bullet"/>
+      <w:lvlText w:val=""/>
+      <w:lvlJc w:val="left"/>
+      <w:pPr>
+        <w:tabs>
+          <w:tab w:val="num" w:pos="5040"/>
+        </w:tabs>
+        <w:ind w:left="5040" w:hanging="360"/>
+      </w:pPr>
+      <w:rPr>
+        <w:rFonts w:ascii="Wingdings" w:hAnsi="Wingdings" w:hint="default"/>
+        <w:sz w:val="20"/>
+      </w:rPr>
+    </w:lvl>
+    <w:lvl w:ilvl="7" w:tentative="1">
+      <w:start w:val="1"/>
+      <w:numFmt w:val="bullet"/>
+      <w:lvlText w:val=""/>
+      <w:lvlJc w:val="left"/>
+      <w:pPr>
+        <w:tabs>
+          <w:tab w:val="num" w:pos="5760"/>
+        </w:tabs>
+        <w:ind w:left="5760" w:hanging="360"/>
+      </w:pPr>
+      <w:rPr>
+        <w:rFonts w:ascii="Wingdings" w:hAnsi="Wingdings" w:hint="default"/>
+        <w:sz w:val="20"/>
+      </w:rPr>
+    </w:lvl>
+    <w:lvl w:ilvl="8" w:tentative="1">
+      <w:start w:val="1"/>
+      <w:numFmt w:val="bullet"/>
+      <w:lvlText w:val=""/>
+      <w:lvlJc w:val="left"/>
+      <w:pPr>
+        <w:tabs>
+          <w:tab w:val="num" w:pos="6480"/>
+        </w:tabs>
+        <w:ind w:left="6480" w:hanging="360"/>
+      </w:pPr>
+      <w:rPr>
+        <w:rFonts w:ascii="Wingdings" w:hAnsi="Wingdings" w:hint="default"/>
+        <w:sz w:val="20"/>
+      </w:rPr>
+    </w:lvl>
+  </w:abstractNum>
+  <w:abstractNum w:abstractNumId="16" w15:restartNumberingAfterBreak="0">
+    <w:nsid w:val="615966EF"/>
+    <w:multiLevelType w:val="multilevel"/>
+    <w:tmpl w:val="31F03244"/>
+    <w:lvl w:ilvl="0">
+      <w:start w:val="1"/>
+      <w:numFmt w:val="bullet"/>
+      <w:lvlText w:val=""/>
+      <w:lvlJc w:val="left"/>
+      <w:pPr>
+        <w:tabs>
+          <w:tab w:val="num" w:pos="720"/>
+        </w:tabs>
+        <w:ind w:left="720" w:hanging="360"/>
+      </w:pPr>
+      <w:rPr>
+        <w:rFonts w:ascii="Symbol" w:hAnsi="Symbol" w:hint="default"/>
+        <w:sz w:val="20"/>
+      </w:rPr>
+    </w:lvl>
+    <w:lvl w:ilvl="1" w:tentative="1">
+      <w:start w:val="1"/>
+      <w:numFmt w:val="bullet"/>
+      <w:lvlText w:val="o"/>
+      <w:lvlJc w:val="left"/>
+      <w:pPr>
+        <w:tabs>
+          <w:tab w:val="num" w:pos="1440"/>
+        </w:tabs>
+        <w:ind w:left="1440" w:hanging="360"/>
+      </w:pPr>
+      <w:rPr>
+        <w:rFonts w:ascii="Courier New" w:hAnsi="Courier New" w:hint="default"/>
+        <w:sz w:val="20"/>
+      </w:rPr>
+    </w:lvl>
+    <w:lvl w:ilvl="2" w:tentative="1">
+      <w:start w:val="1"/>
+      <w:numFmt w:val="bullet"/>
+      <w:lvlText w:val=""/>
+      <w:lvlJc w:val="left"/>
+      <w:pPr>
+        <w:tabs>
+          <w:tab w:val="num" w:pos="2160"/>
+        </w:tabs>
+        <w:ind w:left="2160" w:hanging="360"/>
+      </w:pPr>
+      <w:rPr>
+        <w:rFonts w:ascii="Wingdings" w:hAnsi="Wingdings" w:hint="default"/>
+        <w:sz w:val="20"/>
+      </w:rPr>
+    </w:lvl>
+    <w:lvl w:ilvl="3" w:tentative="1">
+      <w:start w:val="1"/>
+      <w:numFmt w:val="bullet"/>
+      <w:lvlText w:val=""/>
+      <w:lvlJc w:val="left"/>
+      <w:pPr>
+        <w:tabs>
+          <w:tab w:val="num" w:pos="2880"/>
+        </w:tabs>
+        <w:ind w:left="2880" w:hanging="360"/>
+      </w:pPr>
+      <w:rPr>
+        <w:rFonts w:ascii="Wingdings" w:hAnsi="Wingdings" w:hint="default"/>
+        <w:sz w:val="20"/>
+      </w:rPr>
+    </w:lvl>
+    <w:lvl w:ilvl="4" w:tentative="1">
+      <w:start w:val="1"/>
+      <w:numFmt w:val="bullet"/>
+      <w:lvlText w:val=""/>
+      <w:lvlJc w:val="left"/>
+      <w:pPr>
+        <w:tabs>
+          <w:tab w:val="num" w:pos="3600"/>
+        </w:tabs>
+        <w:ind w:left="3600" w:hanging="360"/>
+      </w:pPr>
+      <w:rPr>
+        <w:rFonts w:ascii="Wingdings" w:hAnsi="Wingdings" w:hint="default"/>
+        <w:sz w:val="20"/>
+      </w:rPr>
+    </w:lvl>
+    <w:lvl w:ilvl="5" w:tentative="1">
+      <w:start w:val="1"/>
+      <w:numFmt w:val="bullet"/>
+      <w:lvlText w:val=""/>
+      <w:lvlJc w:val="left"/>
+      <w:pPr>
+        <w:tabs>
+          <w:tab w:val="num" w:pos="4320"/>
+        </w:tabs>
+        <w:ind w:left="4320" w:hanging="360"/>
+      </w:pPr>
+      <w:rPr>
+        <w:rFonts w:ascii="Wingdings" w:hAnsi="Wingdings" w:hint="default"/>
+        <w:sz w:val="20"/>
+      </w:rPr>
+    </w:lvl>
+    <w:lvl w:ilvl="6" w:tentative="1">
+      <w:start w:val="1"/>
+      <w:numFmt w:val="bullet"/>
+      <w:lvlText w:val=""/>
+      <w:lvlJc w:val="left"/>
+      <w:pPr>
+        <w:tabs>
+          <w:tab w:val="num" w:pos="5040"/>
+        </w:tabs>
+        <w:ind w:left="5040" w:hanging="360"/>
+      </w:pPr>
+      <w:rPr>
+        <w:rFonts w:ascii="Wingdings" w:hAnsi="Wingdings" w:hint="default"/>
+        <w:sz w:val="20"/>
+      </w:rPr>
+    </w:lvl>
+    <w:lvl w:ilvl="7" w:tentative="1">
+      <w:start w:val="1"/>
+      <w:numFmt w:val="bullet"/>
+      <w:lvlText w:val=""/>
+      <w:lvlJc w:val="left"/>
+      <w:pPr>
+        <w:tabs>
+          <w:tab w:val="num" w:pos="5760"/>
+        </w:tabs>
+        <w:ind w:left="5760" w:hanging="360"/>
+      </w:pPr>
+      <w:rPr>
+        <w:rFonts w:ascii="Wingdings" w:hAnsi="Wingdings" w:hint="default"/>
+        <w:sz w:val="20"/>
+      </w:rPr>
+    </w:lvl>
+    <w:lvl w:ilvl="8" w:tentative="1">
+      <w:start w:val="1"/>
+      <w:numFmt w:val="bullet"/>
+      <w:lvlText w:val=""/>
+      <w:lvlJc w:val="left"/>
+      <w:pPr>
+        <w:tabs>
+          <w:tab w:val="num" w:pos="6480"/>
+        </w:tabs>
+        <w:ind w:left="6480" w:hanging="360"/>
+      </w:pPr>
+      <w:rPr>
+        <w:rFonts w:ascii="Wingdings" w:hAnsi="Wingdings" w:hint="default"/>
+        <w:sz w:val="20"/>
+      </w:rPr>
+    </w:lvl>
+  </w:abstractNum>
+  <w:abstractNum w:abstractNumId="17" w15:restartNumberingAfterBreak="0">
+    <w:nsid w:val="69A81175"/>
+    <w:multiLevelType w:val="multilevel"/>
+    <w:tmpl w:val="ECB2FA5C"/>
+    <w:lvl w:ilvl="0">
+      <w:start w:val="1"/>
+      <w:numFmt w:val="bullet"/>
+      <w:lvlText w:val=""/>
+      <w:lvlJc w:val="left"/>
+      <w:pPr>
+        <w:tabs>
+          <w:tab w:val="num" w:pos="720"/>
+        </w:tabs>
+        <w:ind w:left="720" w:hanging="360"/>
+      </w:pPr>
+      <w:rPr>
+        <w:rFonts w:ascii="Symbol" w:hAnsi="Symbol" w:hint="default"/>
+        <w:sz w:val="20"/>
+      </w:rPr>
+    </w:lvl>
+    <w:lvl w:ilvl="1" w:tentative="1">
+      <w:start w:val="1"/>
+      <w:numFmt w:val="bullet"/>
+      <w:lvlText w:val="o"/>
+      <w:lvlJc w:val="left"/>
+      <w:pPr>
+        <w:tabs>
+          <w:tab w:val="num" w:pos="1440"/>
+        </w:tabs>
+        <w:ind w:left="1440" w:hanging="360"/>
+      </w:pPr>
+      <w:rPr>
+        <w:rFonts w:ascii="Courier New" w:hAnsi="Courier New" w:hint="default"/>
+        <w:sz w:val="20"/>
+      </w:rPr>
+    </w:lvl>
+    <w:lvl w:ilvl="2" w:tentative="1">
+      <w:start w:val="1"/>
+      <w:numFmt w:val="bullet"/>
+      <w:lvlText w:val=""/>
+      <w:lvlJc w:val="left"/>
+      <w:pPr>
+        <w:tabs>
+          <w:tab w:val="num" w:pos="2160"/>
+        </w:tabs>
+        <w:ind w:left="2160" w:hanging="360"/>
+      </w:pPr>
+      <w:rPr>
+        <w:rFonts w:ascii="Wingdings" w:hAnsi="Wingdings" w:hint="default"/>
+        <w:sz w:val="20"/>
+      </w:rPr>
+    </w:lvl>
+    <w:lvl w:ilvl="3" w:tentative="1">
+      <w:start w:val="1"/>
+      <w:numFmt w:val="bullet"/>
+      <w:lvlText w:val=""/>
+      <w:lvlJc w:val="left"/>
+      <w:pPr>
+        <w:tabs>
+          <w:tab w:val="num" w:pos="2880"/>
+        </w:tabs>
+        <w:ind w:left="2880" w:hanging="360"/>
+      </w:pPr>
+      <w:rPr>
+        <w:rFonts w:ascii="Wingdings" w:hAnsi="Wingdings" w:hint="default"/>
+        <w:sz w:val="20"/>
+      </w:rPr>
+    </w:lvl>
+    <w:lvl w:ilvl="4" w:tentative="1">
+      <w:start w:val="1"/>
+      <w:numFmt w:val="bullet"/>
+      <w:lvlText w:val=""/>
+      <w:lvlJc w:val="left"/>
+      <w:pPr>
+        <w:tabs>
+          <w:tab w:val="num" w:pos="3600"/>
+        </w:tabs>
+        <w:ind w:left="3600" w:hanging="360"/>
+      </w:pPr>
+      <w:rPr>
+        <w:rFonts w:ascii="Wingdings" w:hAnsi="Wingdings" w:hint="default"/>
+        <w:sz w:val="20"/>
+      </w:rPr>
+    </w:lvl>
+    <w:lvl w:ilvl="5" w:tentative="1">
+      <w:start w:val="1"/>
+      <w:numFmt w:val="bullet"/>
+      <w:lvlText w:val=""/>
+      <w:lvlJc w:val="left"/>
+      <w:pPr>
+        <w:tabs>
+          <w:tab w:val="num" w:pos="4320"/>
+        </w:tabs>
+        <w:ind w:left="4320" w:hanging="360"/>
+      </w:pPr>
+      <w:rPr>
+        <w:rFonts w:ascii="Wingdings" w:hAnsi="Wingdings" w:hint="default"/>
+        <w:sz w:val="20"/>
+      </w:rPr>
+    </w:lvl>
+    <w:lvl w:ilvl="6" w:tentative="1">
+      <w:start w:val="1"/>
+      <w:numFmt w:val="bullet"/>
+      <w:lvlText w:val=""/>
+      <w:lvlJc w:val="left"/>
+      <w:pPr>
+        <w:tabs>
+          <w:tab w:val="num" w:pos="5040"/>
+        </w:tabs>
+        <w:ind w:left="5040" w:hanging="360"/>
+      </w:pPr>
+      <w:rPr>
+        <w:rFonts w:ascii="Wingdings" w:hAnsi="Wingdings" w:hint="default"/>
+        <w:sz w:val="20"/>
+      </w:rPr>
+    </w:lvl>
+    <w:lvl w:ilvl="7" w:tentative="1">
+      <w:start w:val="1"/>
+      <w:numFmt w:val="bullet"/>
+      <w:lvlText w:val=""/>
+      <w:lvlJc w:val="left"/>
+      <w:pPr>
+        <w:tabs>
+          <w:tab w:val="num" w:pos="5760"/>
+        </w:tabs>
+        <w:ind w:left="5760" w:hanging="360"/>
+      </w:pPr>
+      <w:rPr>
+        <w:rFonts w:ascii="Wingdings" w:hAnsi="Wingdings" w:hint="default"/>
+        <w:sz w:val="20"/>
+      </w:rPr>
+    </w:lvl>
+    <w:lvl w:ilvl="8" w:tentative="1">
+      <w:start w:val="1"/>
+      <w:numFmt w:val="bullet"/>
+      <w:lvlText w:val=""/>
+      <w:lvlJc w:val="left"/>
+      <w:pPr>
+        <w:tabs>
+          <w:tab w:val="num" w:pos="6480"/>
+        </w:tabs>
+        <w:ind w:left="6480" w:hanging="360"/>
+      </w:pPr>
+      <w:rPr>
+        <w:rFonts w:ascii="Wingdings" w:hAnsi="Wingdings" w:hint="default"/>
+        <w:sz w:val="20"/>
+      </w:rPr>
+    </w:lvl>
+  </w:abstractNum>
+  <w:abstractNum w:abstractNumId="18" w15:restartNumberingAfterBreak="0">
+    <w:nsid w:val="6DB74AFD"/>
+    <w:multiLevelType w:val="multilevel"/>
+    <w:tmpl w:val="02C6A240"/>
+    <w:lvl w:ilvl="0">
+      <w:start w:val="1"/>
+      <w:numFmt w:val="bullet"/>
+      <w:lvlText w:val=""/>
+      <w:lvlJc w:val="left"/>
+      <w:pPr>
+        <w:tabs>
+          <w:tab w:val="num" w:pos="720"/>
+        </w:tabs>
+        <w:ind w:left="720" w:hanging="360"/>
+      </w:pPr>
+      <w:rPr>
+        <w:rFonts w:ascii="Symbol" w:hAnsi="Symbol" w:hint="default"/>
+        <w:sz w:val="20"/>
+      </w:rPr>
+    </w:lvl>
+    <w:lvl w:ilvl="1" w:tentative="1">
+      <w:start w:val="1"/>
+      <w:numFmt w:val="bullet"/>
+      <w:lvlText w:val="o"/>
+      <w:lvlJc w:val="left"/>
+      <w:pPr>
+        <w:tabs>
+          <w:tab w:val="num" w:pos="1440"/>
+        </w:tabs>
+        <w:ind w:left="1440" w:hanging="360"/>
+      </w:pPr>
+      <w:rPr>
+        <w:rFonts w:ascii="Courier New" w:hAnsi="Courier New" w:hint="default"/>
+        <w:sz w:val="20"/>
+      </w:rPr>
+    </w:lvl>
+    <w:lvl w:ilvl="2" w:tentative="1">
+      <w:start w:val="1"/>
+      <w:numFmt w:val="bullet"/>
+      <w:lvlText w:val=""/>
+      <w:lvlJc w:val="left"/>
+      <w:pPr>
+        <w:tabs>
+          <w:tab w:val="num" w:pos="2160"/>
+        </w:tabs>
+        <w:ind w:left="2160" w:hanging="360"/>
+      </w:pPr>
+      <w:rPr>
+        <w:rFonts w:ascii="Wingdings" w:hAnsi="Wingdings" w:hint="default"/>
+        <w:sz w:val="20"/>
+      </w:rPr>
+    </w:lvl>
+    <w:lvl w:ilvl="3" w:tentative="1">
+      <w:start w:val="1"/>
+      <w:numFmt w:val="bullet"/>
+      <w:lvlText w:val=""/>
+      <w:lvlJc w:val="left"/>
+      <w:pPr>
+        <w:tabs>
+          <w:tab w:val="num" w:pos="2880"/>
+        </w:tabs>
+        <w:ind w:left="2880" w:hanging="360"/>
+      </w:pPr>
+      <w:rPr>
+        <w:rFonts w:ascii="Wingdings" w:hAnsi="Wingdings" w:hint="default"/>
+        <w:sz w:val="20"/>
+      </w:rPr>
+    </w:lvl>
+    <w:lvl w:ilvl="4" w:tentative="1">
+      <w:start w:val="1"/>
+      <w:numFmt w:val="bullet"/>
+      <w:lvlText w:val=""/>
+      <w:lvlJc w:val="left"/>
+      <w:pPr>
+        <w:tabs>
+          <w:tab w:val="num" w:pos="3600"/>
+        </w:tabs>
+        <w:ind w:left="3600" w:hanging="360"/>
+      </w:pPr>
+      <w:rPr>
+        <w:rFonts w:ascii="Wingdings" w:hAnsi="Wingdings" w:hint="default"/>
+        <w:sz w:val="20"/>
+      </w:rPr>
+    </w:lvl>
+    <w:lvl w:ilvl="5" w:tentative="1">
+      <w:start w:val="1"/>
+      <w:numFmt w:val="bullet"/>
+      <w:lvlText w:val=""/>
+      <w:lvlJc w:val="left"/>
+      <w:pPr>
+        <w:tabs>
+          <w:tab w:val="num" w:pos="4320"/>
+        </w:tabs>
+        <w:ind w:left="4320" w:hanging="360"/>
+      </w:pPr>
+      <w:rPr>
+        <w:rFonts w:ascii="Wingdings" w:hAnsi="Wingdings" w:hint="default"/>
+        <w:sz w:val="20"/>
+      </w:rPr>
+    </w:lvl>
+    <w:lvl w:ilvl="6" w:tentative="1">
+      <w:start w:val="1"/>
+      <w:numFmt w:val="bullet"/>
+      <w:lvlText w:val=""/>
+      <w:lvlJc w:val="left"/>
+      <w:pPr>
+        <w:tabs>
+          <w:tab w:val="num" w:pos="5040"/>
+        </w:tabs>
+        <w:ind w:left="5040" w:hanging="360"/>
+      </w:pPr>
+      <w:rPr>
+        <w:rFonts w:ascii="Wingdings" w:hAnsi="Wingdings" w:hint="default"/>
+        <w:sz w:val="20"/>
+      </w:rPr>
+    </w:lvl>
+    <w:lvl w:ilvl="7" w:tentative="1">
+      <w:start w:val="1"/>
+      <w:numFmt w:val="bullet"/>
+      <w:lvlText w:val=""/>
+      <w:lvlJc w:val="left"/>
+      <w:pPr>
+        <w:tabs>
+          <w:tab w:val="num" w:pos="5760"/>
+        </w:tabs>
+        <w:ind w:left="5760" w:hanging="360"/>
+      </w:pPr>
+      <w:rPr>
+        <w:rFonts w:ascii="Wingdings" w:hAnsi="Wingdings" w:hint="default"/>
+        <w:sz w:val="20"/>
+      </w:rPr>
+    </w:lvl>
+    <w:lvl w:ilvl="8" w:tentative="1">
+      <w:start w:val="1"/>
+      <w:numFmt w:val="bullet"/>
+      <w:lvlText w:val=""/>
+      <w:lvlJc w:val="left"/>
+      <w:pPr>
+        <w:tabs>
+          <w:tab w:val="num" w:pos="6480"/>
+        </w:tabs>
+        <w:ind w:left="6480" w:hanging="360"/>
+      </w:pPr>
+      <w:rPr>
+        <w:rFonts w:ascii="Wingdings" w:hAnsi="Wingdings" w:hint="default"/>
+        <w:sz w:val="20"/>
+      </w:rPr>
+    </w:lvl>
+  </w:abstractNum>
+  <w:abstractNum w:abstractNumId="19" w15:restartNumberingAfterBreak="0">
+    <w:nsid w:val="71EA6708"/>
+    <w:multiLevelType w:val="multilevel"/>
+    <w:tmpl w:val="E4260CCC"/>
+    <w:lvl w:ilvl="0">
+      <w:start w:val="1"/>
+      <w:numFmt w:val="bullet"/>
+      <w:lvlText w:val=""/>
+      <w:lvlJc w:val="left"/>
+      <w:pPr>
+        <w:tabs>
+          <w:tab w:val="num" w:pos="720"/>
+        </w:tabs>
+        <w:ind w:left="720" w:hanging="360"/>
+      </w:pPr>
+      <w:rPr>
+        <w:rFonts w:ascii="Symbol" w:hAnsi="Symbol" w:hint="default"/>
+        <w:sz w:val="20"/>
+      </w:rPr>
+    </w:lvl>
+    <w:lvl w:ilvl="1" w:tentative="1">
+      <w:start w:val="1"/>
+      <w:numFmt w:val="bullet"/>
+      <w:lvlText w:val="o"/>
+      <w:lvlJc w:val="left"/>
+      <w:pPr>
+        <w:tabs>
+          <w:tab w:val="num" w:pos="1440"/>
+        </w:tabs>
+        <w:ind w:left="1440" w:hanging="360"/>
+      </w:pPr>
+      <w:rPr>
+        <w:rFonts w:ascii="Courier New" w:hAnsi="Courier New" w:hint="default"/>
+        <w:sz w:val="20"/>
+      </w:rPr>
+    </w:lvl>
+    <w:lvl w:ilvl="2" w:tentative="1">
+      <w:start w:val="1"/>
+      <w:numFmt w:val="bullet"/>
+      <w:lvlText w:val=""/>
+      <w:lvlJc w:val="left"/>
+      <w:pPr>
+        <w:tabs>
+          <w:tab w:val="num" w:pos="2160"/>
+        </w:tabs>
+        <w:ind w:left="2160" w:hanging="360"/>
+      </w:pPr>
+      <w:rPr>
+        <w:rFonts w:ascii="Wingdings" w:hAnsi="Wingdings" w:hint="default"/>
+        <w:sz w:val="20"/>
+      </w:rPr>
+    </w:lvl>
+    <w:lvl w:ilvl="3" w:tentative="1">
+      <w:start w:val="1"/>
+      <w:numFmt w:val="bullet"/>
+      <w:lvlText w:val=""/>
+      <w:lvlJc w:val="left"/>
+      <w:pPr>
+        <w:tabs>
+          <w:tab w:val="num" w:pos="2880"/>
+        </w:tabs>
+        <w:ind w:left="2880" w:hanging="360"/>
+      </w:pPr>
+      <w:rPr>
+        <w:rFonts w:ascii="Wingdings" w:hAnsi="Wingdings" w:hint="default"/>
+        <w:sz w:val="20"/>
+      </w:rPr>
+    </w:lvl>
+    <w:lvl w:ilvl="4" w:tentative="1">
+      <w:start w:val="1"/>
+      <w:numFmt w:val="bullet"/>
+      <w:lvlText w:val=""/>
+      <w:lvlJc w:val="left"/>
+      <w:pPr>
+        <w:tabs>
+          <w:tab w:val="num" w:pos="3600"/>
+        </w:tabs>
+        <w:ind w:left="3600" w:hanging="360"/>
+      </w:pPr>
+      <w:rPr>
+        <w:rFonts w:ascii="Wingdings" w:hAnsi="Wingdings" w:hint="default"/>
+        <w:sz w:val="20"/>
+      </w:rPr>
+    </w:lvl>
+    <w:lvl w:ilvl="5" w:tentative="1">
+      <w:start w:val="1"/>
+      <w:numFmt w:val="bullet"/>
+      <w:lvlText w:val=""/>
+      <w:lvlJc w:val="left"/>
+      <w:pPr>
+        <w:tabs>
+          <w:tab w:val="num" w:pos="4320"/>
+        </w:tabs>
+        <w:ind w:left="4320" w:hanging="360"/>
+      </w:pPr>
+      <w:rPr>
+        <w:rFonts w:ascii="Wingdings" w:hAnsi="Wingdings" w:hint="default"/>
+        <w:sz w:val="20"/>
+      </w:rPr>
+    </w:lvl>
+    <w:lvl w:ilvl="6" w:tentative="1">
+      <w:start w:val="1"/>
+      <w:numFmt w:val="bullet"/>
+      <w:lvlText w:val=""/>
+      <w:lvlJc w:val="left"/>
+      <w:pPr>
+        <w:tabs>
+          <w:tab w:val="num" w:pos="5040"/>
+        </w:tabs>
+        <w:ind w:left="5040" w:hanging="360"/>
+      </w:pPr>
+      <w:rPr>
+        <w:rFonts w:ascii="Wingdings" w:hAnsi="Wingdings" w:hint="default"/>
+        <w:sz w:val="20"/>
+      </w:rPr>
+    </w:lvl>
+    <w:lvl w:ilvl="7" w:tentative="1">
+      <w:start w:val="1"/>
+      <w:numFmt w:val="bullet"/>
+      <w:lvlText w:val=""/>
+      <w:lvlJc w:val="left"/>
+      <w:pPr>
+        <w:tabs>
+          <w:tab w:val="num" w:pos="5760"/>
+        </w:tabs>
+        <w:ind w:left="5760" w:hanging="360"/>
+      </w:pPr>
+      <w:rPr>
+        <w:rFonts w:ascii="Wingdings" w:hAnsi="Wingdings" w:hint="default"/>
+        <w:sz w:val="20"/>
+      </w:rPr>
+    </w:lvl>
+    <w:lvl w:ilvl="8" w:tentative="1">
+      <w:start w:val="1"/>
+      <w:numFmt w:val="bullet"/>
+      <w:lvlText w:val=""/>
+      <w:lvlJc w:val="left"/>
+      <w:pPr>
+        <w:tabs>
+          <w:tab w:val="num" w:pos="6480"/>
+        </w:tabs>
+        <w:ind w:left="6480" w:hanging="360"/>
+      </w:pPr>
+      <w:rPr>
+        <w:rFonts w:ascii="Wingdings" w:hAnsi="Wingdings" w:hint="default"/>
+        <w:sz w:val="20"/>
+      </w:rPr>
+    </w:lvl>
+  </w:abstractNum>
+  <w:abstractNum w:abstractNumId="20" w15:restartNumberingAfterBreak="0">
+    <w:nsid w:val="75A104C1"/>
+    <w:multiLevelType w:val="multilevel"/>
+    <w:tmpl w:val="41D2A6A2"/>
+    <w:lvl w:ilvl="0">
+      <w:start w:val="1"/>
+      <w:numFmt w:val="bullet"/>
+      <w:lvlText w:val=""/>
+      <w:lvlJc w:val="left"/>
+      <w:pPr>
+        <w:tabs>
+          <w:tab w:val="num" w:pos="720"/>
+        </w:tabs>
+        <w:ind w:left="720" w:hanging="360"/>
+      </w:pPr>
+      <w:rPr>
+        <w:rFonts w:ascii="Symbol" w:hAnsi="Symbol" w:hint="default"/>
+        <w:sz w:val="20"/>
+      </w:rPr>
+    </w:lvl>
+    <w:lvl w:ilvl="1">
+      <w:start w:val="1"/>
+      <w:numFmt w:val="bullet"/>
+      <w:lvlText w:val="o"/>
+      <w:lvlJc w:val="left"/>
+      <w:pPr>
+        <w:tabs>
+          <w:tab w:val="num" w:pos="1440"/>
+        </w:tabs>
+        <w:ind w:left="1440" w:hanging="360"/>
+      </w:pPr>
+      <w:rPr>
+        <w:rFonts w:ascii="Courier New" w:hAnsi="Courier New" w:hint="default"/>
+        <w:sz w:val="20"/>
+      </w:rPr>
+    </w:lvl>
+    <w:lvl w:ilvl="2" w:tentative="1">
+      <w:start w:val="1"/>
+      <w:numFmt w:val="bullet"/>
+      <w:lvlText w:val=""/>
+      <w:lvlJc w:val="left"/>
+      <w:pPr>
+        <w:tabs>
+          <w:tab w:val="num" w:pos="2160"/>
+        </w:tabs>
+        <w:ind w:left="2160" w:hanging="360"/>
+      </w:pPr>
+      <w:rPr>
+        <w:rFonts w:ascii="Wingdings" w:hAnsi="Wingdings" w:hint="default"/>
+        <w:sz w:val="20"/>
+      </w:rPr>
+    </w:lvl>
+    <w:lvl w:ilvl="3" w:tentative="1">
+      <w:start w:val="1"/>
+      <w:numFmt w:val="bullet"/>
+      <w:lvlText w:val=""/>
+      <w:lvlJc w:val="left"/>
+      <w:pPr>
+        <w:tabs>
+          <w:tab w:val="num" w:pos="2880"/>
+        </w:tabs>
+        <w:ind w:left="2880" w:hanging="360"/>
+      </w:pPr>
+      <w:rPr>
+        <w:rFonts w:ascii="Wingdings" w:hAnsi="Wingdings" w:hint="default"/>
+        <w:sz w:val="20"/>
+      </w:rPr>
+    </w:lvl>
+    <w:lvl w:ilvl="4" w:tentative="1">
+      <w:start w:val="1"/>
+      <w:numFmt w:val="bullet"/>
+      <w:lvlText w:val=""/>
+      <w:lvlJc w:val="left"/>
+      <w:pPr>
+        <w:tabs>
+          <w:tab w:val="num" w:pos="3600"/>
+        </w:tabs>
+        <w:ind w:left="3600" w:hanging="360"/>
+      </w:pPr>
+      <w:rPr>
+        <w:rFonts w:ascii="Wingdings" w:hAnsi="Wingdings" w:hint="default"/>
+        <w:sz w:val="20"/>
+      </w:rPr>
+    </w:lvl>
+    <w:lvl w:ilvl="5" w:tentative="1">
+      <w:start w:val="1"/>
+      <w:numFmt w:val="bullet"/>
+      <w:lvlText w:val=""/>
+      <w:lvlJc w:val="left"/>
+      <w:pPr>
+        <w:tabs>
+          <w:tab w:val="num" w:pos="4320"/>
+        </w:tabs>
+        <w:ind w:left="4320" w:hanging="360"/>
+      </w:pPr>
+      <w:rPr>
+        <w:rFonts w:ascii="Wingdings" w:hAnsi="Wingdings" w:hint="default"/>
+        <w:sz w:val="20"/>
+      </w:rPr>
+    </w:lvl>
+    <w:lvl w:ilvl="6" w:tentative="1">
+      <w:start w:val="1"/>
+      <w:numFmt w:val="bullet"/>
+      <w:lvlText w:val=""/>
+      <w:lvlJc w:val="left"/>
+      <w:pPr>
+        <w:tabs>
+          <w:tab w:val="num" w:pos="5040"/>
+        </w:tabs>
+        <w:ind w:left="5040" w:hanging="360"/>
+      </w:pPr>
+      <w:rPr>
+        <w:rFonts w:ascii="Wingdings" w:hAnsi="Wingdings" w:hint="default"/>
+        <w:sz w:val="20"/>
+      </w:rPr>
+    </w:lvl>
+    <w:lvl w:ilvl="7" w:tentative="1">
+      <w:start w:val="1"/>
+      <w:numFmt w:val="bullet"/>
+      <w:lvlText w:val=""/>
+      <w:lvlJc w:val="left"/>
+      <w:pPr>
+        <w:tabs>
+          <w:tab w:val="num" w:pos="5760"/>
+        </w:tabs>
+        <w:ind w:left="5760" w:hanging="360"/>
+      </w:pPr>
+      <w:rPr>
+        <w:rFonts w:ascii="Wingdings" w:hAnsi="Wingdings" w:hint="default"/>
+        <w:sz w:val="20"/>
+      </w:rPr>
+    </w:lvl>
+    <w:lvl w:ilvl="8" w:tentative="1">
+      <w:start w:val="1"/>
+      <w:numFmt w:val="bullet"/>
+      <w:lvlText w:val=""/>
+      <w:lvlJc w:val="left"/>
+      <w:pPr>
+        <w:tabs>
+          <w:tab w:val="num" w:pos="6480"/>
+        </w:tabs>
+        <w:ind w:left="6480" w:hanging="360"/>
+      </w:pPr>
+      <w:rPr>
+        <w:rFonts w:ascii="Wingdings" w:hAnsi="Wingdings" w:hint="default"/>
+        <w:sz w:val="20"/>
+      </w:rPr>
+    </w:lvl>
+  </w:abstractNum>
+  <w:num w:numId="1" w16cid:durableId="380793083">
+    <w:abstractNumId w:val="10"/>
+  </w:num>
+  <w:num w:numId="2" w16cid:durableId="2079745825">
+    <w:abstractNumId w:val="6"/>
+  </w:num>
+  <w:num w:numId="3" w16cid:durableId="61218988">
+    <w:abstractNumId w:val="5"/>
+  </w:num>
+  <w:num w:numId="4" w16cid:durableId="760221235">
+    <w:abstractNumId w:val="3"/>
+  </w:num>
+  <w:num w:numId="5" w16cid:durableId="847408974">
+    <w:abstractNumId w:val="17"/>
+  </w:num>
+  <w:num w:numId="6" w16cid:durableId="1369986658">
+    <w:abstractNumId w:val="13"/>
+  </w:num>
+  <w:num w:numId="7" w16cid:durableId="695086250">
+    <w:abstractNumId w:val="9"/>
+  </w:num>
+  <w:num w:numId="8" w16cid:durableId="1299994189">
+    <w:abstractNumId w:val="11"/>
+  </w:num>
+  <w:num w:numId="9" w16cid:durableId="1351028462">
+    <w:abstractNumId w:val="1"/>
+  </w:num>
+  <w:num w:numId="10" w16cid:durableId="531578066">
+    <w:abstractNumId w:val="20"/>
+  </w:num>
+  <w:num w:numId="11" w16cid:durableId="701711672">
+    <w:abstractNumId w:val="0"/>
+  </w:num>
+  <w:num w:numId="12" w16cid:durableId="131604559">
+    <w:abstractNumId w:val="12"/>
+  </w:num>
+  <w:num w:numId="13" w16cid:durableId="332496849">
+    <w:abstractNumId w:val="8"/>
+  </w:num>
+  <w:num w:numId="14" w16cid:durableId="1253127086">
+    <w:abstractNumId w:val="14"/>
+  </w:num>
+  <w:num w:numId="15" w16cid:durableId="329603315">
+    <w:abstractNumId w:val="15"/>
+  </w:num>
+  <w:num w:numId="16" w16cid:durableId="1418865999">
+    <w:abstractNumId w:val="2"/>
+  </w:num>
+  <w:num w:numId="17" w16cid:durableId="1733306407">
+    <w:abstractNumId w:val="16"/>
+  </w:num>
+  <w:num w:numId="18" w16cid:durableId="532378368">
+    <w:abstractNumId w:val="7"/>
+  </w:num>
+  <w:num w:numId="19" w16cid:durableId="1957711915">
+    <w:abstractNumId w:val="4"/>
+  </w:num>
+  <w:num w:numId="20" w16cid:durableId="2121100594">
+    <w:abstractNumId w:val="18"/>
+  </w:num>
+  <w:num w:numId="21" w16cid:durableId="972758203">
+    <w:abstractNumId w:val="19"/>
+  </w:num>
+</w:numbering>
 </file>
 
 <file path=word/styles.xml><?xml version="1.0" encoding="utf-8"?>
@@ -834,7 +5471,6 @@
   <w:style w:type="character" w:default="1" w:styleId="DefaultParagraphFont">
     <w:name w:val="Default Paragraph Font"/>
     <w:uiPriority w:val="1"/>
-    <w:semiHidden/>
     <w:unhideWhenUsed/>
   </w:style>
   <w:style w:type="table" w:default="1" w:styleId="TableNormal">

</xml_diff>